<commit_message>
Revision del Capitulo 2 hasta el punto 2.6, junto inclusion de bibliografia con Zotero
</commit_message>
<xml_diff>
--- a/Módulo 2 - Estado del arte o análisis de mercado del proyecto/TFM_Capitulo2_EstadoDelArte_completo.docx
+++ b/Módulo 2 - Estado del arte o análisis de mercado del proyecto/TFM_Capitulo2_EstadoDelArte_completo.docx
@@ -9558,21 +9558,7 @@
         <w:rPr>
           <w:rFonts w:ascii="Calibri" w:hAnsi="Calibri" w:cs="Calibri"/>
         </w:rPr>
-        <w:t>(</w:t>
-      </w:r>
-      <w:proofErr w:type="spellStart"/>
-      <w:r>
-        <w:rPr>
-          <w:rFonts w:ascii="Calibri" w:hAnsi="Calibri" w:cs="Calibri"/>
-        </w:rPr>
-        <w:t>Oates</w:t>
-      </w:r>
-      <w:proofErr w:type="spellEnd"/>
-      <w:r>
-        <w:rPr>
-          <w:rFonts w:ascii="Calibri" w:hAnsi="Calibri" w:cs="Calibri"/>
-        </w:rPr>
-        <w:t xml:space="preserve"> 2022)</w:t>
+        <w:t>(Oates 2022)</w:t>
       </w:r>
       <w:r>
         <w:fldChar w:fldCharType="end"/>
@@ -10042,23 +10028,7 @@
           <w:rFonts w:cstheme="minorHAnsi"/>
           <w:sz w:val="22"/>
         </w:rPr>
-        <w:t>(Le-</w:t>
-      </w:r>
-      <w:proofErr w:type="spellStart"/>
-      <w:r>
-        <w:rPr>
-          <w:rFonts w:cstheme="minorHAnsi"/>
-          <w:sz w:val="22"/>
-        </w:rPr>
-        <w:t>Rademacher</w:t>
-      </w:r>
-      <w:proofErr w:type="spellEnd"/>
-      <w:r>
-        <w:rPr>
-          <w:rFonts w:cstheme="minorHAnsi"/>
-          <w:sz w:val="22"/>
-        </w:rPr>
-        <w:t xml:space="preserve"> y Wang 2021)</w:t>
+        <w:t>(Le-Rademacher y Wang 2021)</w:t>
       </w:r>
       <w:r>
         <w:rPr>
@@ -10215,23 +10185,7 @@
           <w:rFonts w:cstheme="minorHAnsi"/>
           <w:sz w:val="22"/>
         </w:rPr>
-        <w:t>(</w:t>
-      </w:r>
-      <w:proofErr w:type="spellStart"/>
-      <w:r>
-        <w:rPr>
-          <w:rFonts w:cstheme="minorHAnsi"/>
-          <w:sz w:val="22"/>
-        </w:rPr>
-        <w:t>Tibshirani</w:t>
-      </w:r>
-      <w:proofErr w:type="spellEnd"/>
-      <w:r>
-        <w:rPr>
-          <w:rFonts w:cstheme="minorHAnsi"/>
-          <w:sz w:val="22"/>
-        </w:rPr>
-        <w:t xml:space="preserve"> 1997)</w:t>
+        <w:t>(Tibshirani 1997)</w:t>
       </w:r>
       <w:r>
         <w:rPr>
@@ -10281,25 +10235,7 @@
           <w:sz w:val="22"/>
           <w:szCs w:val="24"/>
         </w:rPr>
-        <w:t>(</w:t>
-      </w:r>
-      <w:proofErr w:type="spellStart"/>
-      <w:r>
-        <w:rPr>
-          <w:rFonts w:cstheme="minorHAnsi"/>
-          <w:sz w:val="22"/>
-          <w:szCs w:val="24"/>
-        </w:rPr>
-        <w:t>Stensrud</w:t>
-      </w:r>
-      <w:proofErr w:type="spellEnd"/>
-      <w:r>
-        <w:rPr>
-          <w:rFonts w:cstheme="minorHAnsi"/>
-          <w:sz w:val="22"/>
-          <w:szCs w:val="24"/>
-        </w:rPr>
-        <w:t xml:space="preserve"> y Hernán 2020)</w:t>
+        <w:t>(Stensrud y Hernán 2020)</w:t>
       </w:r>
       <w:r>
         <w:rPr>
@@ -10666,21 +10602,12 @@
         </w:rPr>
         <w:fldChar w:fldCharType="separate"/>
       </w:r>
-      <w:proofErr w:type="spellStart"/>
       <w:r>
         <w:rPr>
           <w:rFonts w:ascii="Calibri" w:hAnsi="Calibri" w:cs="Calibri"/>
           <w:sz w:val="22"/>
         </w:rPr>
-        <w:t>Ishwaran</w:t>
-      </w:r>
-      <w:proofErr w:type="spellEnd"/>
-      <w:r>
-        <w:rPr>
-          <w:rFonts w:ascii="Calibri" w:hAnsi="Calibri" w:cs="Calibri"/>
-          <w:sz w:val="22"/>
-        </w:rPr>
-        <w:t xml:space="preserve"> et al. </w:t>
+        <w:t xml:space="preserve">Ishwaran et al. </w:t>
       </w:r>
       <w:r>
         <w:rPr>
@@ -10922,7 +10849,7 @@
           <w:rFonts w:ascii="Arial" w:hAnsi="Arial"/>
           <w:sz w:val="22"/>
         </w:rPr>
-        <w:instrText xml:space="preserve"> ADDIN ZOTERO_ITEM CSL_CITATION {"citationID":"WSN4nbbZ","properties":{"unsorted":false,"formattedCitation":"(Jin et\\uc0\\u160{}al. 2025)","plainCitation":"(Jin et al. 2025)","noteIndex":0},"citationItems":[{"id":174,"uris":["http://zotero.org/users/19775897/items/P7F6FMW2"],"itemData":{"id":174,"type":"article-journal","abstract":"Background: Breast cancer is one of the most common malignancies among women worldwide. Patients who do not achieve a pathological complete response (pCR) or a clinical complete response (cCR) post–neoadjuvant chemotherapy (NAC) typically have a worse prognosis compared to those who do achieve these responses.\nObjective: This study aimed to develop and validate a random survival forest (RSF) model to predict survival risk in patients with breast cancer who do not achieve a pCR or cCR post-NAC.\nMethods: We analyzed patients with no pCR/cCR post-NAC treated at the First Affiliated Hospital of Chongqing Medical University from January 2019 to 2023, with external validation in Duke University and Surveillance, Epidemiology, and End Results (SEER) cohorts. RSF and Cox regression models were compared using the time-dependent area under the curve (AUC), the concordance index (C-index), and risk stratification.\nResults: The study cohort included 306 patients with breast cancer, with most aged 40-60 years (204/306, 66.7%). The majority had invasive ductal carcinoma (290/306, 94.8%), with estrogen receptor (ER)+ (182/306, 59.5%), progesterone receptor (PR)– (179/306, 58.5%), and human epidermal growth factor receptor 2 (HER2)+ (94/306, 30.7%) profiles. Most patients presented with T2 (185/306, 60.5%), N1 (142/306, 46.4%), and M0 (295/306, 96.4%) staging (TNM meaning “tumor, node, metastasis”), with 17.6% (54/306) experiencing disease progression during a median follow-up of 25.9 months (IQR 17.2-36.3). External validation using Duke (N=94) and SEER (N=2760) cohorts confirmed consistent patterns in age (40-60 years: 59/94, 63%, vs 1480/2760, 53.6%), HER2+ rates (26/94, 28%, vs 935/2760, 33.9%), and invasive ductal carcinoma prevalence (89/94, 95%, vs 2506/2760, 90.8%). In the internal cohort, the RSF achieved significantly higher time-dependent AUCs compared to Cox regression at 1-year (0.811 vs 0.763), 3-year (0.834 vs 0.783), and 5-year (0.810 vs 0.771) intervals (overall C-index: 0.803, 95% CI 0.747-0.859, vs 0.736, 95% CI 0.673-0.799). External validation confirmed robust generalizability: the Duke cohort showed 1-, 3-, and 5-year AUCs of 0.912, 0.803, and 0.776, respectively, while the SEER cohort maintained consistent performance with AUCs of 0.771, 0.729, and 0.702, respectively. Risk stratification using the RSF identified 25.8% (79/306) high-risk patients and a significantly reduced survival time (P&amp;lt;.001). Notably, the RSF maintained improved net benefits across decision thresholds in decision curve analysis (DCA); similar results were observed in external studies. The RSF model also showed promising performance across different molecular subtypes in all datasets. Based on the RSF predicted scores, patients were stratified into high- and low-risk groups, with notably poorer survival outcomes observed in the high-risk group compared to the low-risk group.\nConclusions: The RSF model, based solely on clinicopathological variables, provides a promising tool for identifying high-risk patients with breast cancer post-NAC. This approach may facilitate personalized treatment strategies and improve patient management in clinical practice.","container-title":"Journal of Medical Internet Research","DOI":"10.2196/69864","issue":"1","language":"EN","page":"e69864","publisher":"JMIR Publications Inc., Toronto, Canada","source":"www.jmir.org","title":"Comparing Random Survival Forests and Cox Regression for Nonresponders to Neoadjuvant Chemotherapy Among Patients With Breast Cancer: Multicenter Retrospective Cohort Study","title-short":"Comparing Random Survival Forests and Cox Regression for Nonresponders to Neoadjuvant Chemotherapy Among Patients With Breast Cancer","volume":"27","author":[{"family":"Jin","given":"Yudi"},{"family":"Zhao","given":"Min"},{"family":"Su","given":"Tong"},{"family":"Fan","given":"Yanjia"},{"family":"Ouyang","given":"Zubin"},{"family":"Lv","given":"Fajin"}],"issued":{"date-parts":[["2025",4,8]]}}}],"schema":"https://github.com/citation-style-language/schema/raw/master/csl-citation.json"} </w:instrText>
+        <w:instrText xml:space="preserve"> ADDIN ZOTERO_ITEM CSL_CITATION {"citationID":"WSN4nbbZ","properties":{"unsorted":false,"formattedCitation":"(Jin et\\uc0\\u160{}al. 2025)","plainCitation":"(Jin et al. 2025)","dontUpdate":true,"noteIndex":0},"citationItems":[{"id":174,"uris":["http://zotero.org/users/19775897/items/P7F6FMW2"],"itemData":{"id":174,"type":"article-journal","abstract":"Background: Breast cancer is one of the most common malignancies among women worldwide. Patients who do not achieve a pathological complete response (pCR) or a clinical complete response (cCR) post–neoadjuvant chemotherapy (NAC) typically have a worse prognosis compared to those who do achieve these responses.\nObjective: This study aimed to develop and validate a random survival forest (RSF) model to predict survival risk in patients with breast cancer who do not achieve a pCR or cCR post-NAC.\nMethods: We analyzed patients with no pCR/cCR post-NAC treated at the First Affiliated Hospital of Chongqing Medical University from January 2019 to 2023, with external validation in Duke University and Surveillance, Epidemiology, and End Results (SEER) cohorts. RSF and Cox regression models were compared using the time-dependent area under the curve (AUC), the concordance index (C-index), and risk stratification.\nResults: The study cohort included 306 patients with breast cancer, with most aged 40-60 years (204/306, 66.7%). The majority had invasive ductal carcinoma (290/306, 94.8%), with estrogen receptor (ER)+ (182/306, 59.5%), progesterone receptor (PR)– (179/306, 58.5%), and human epidermal growth factor receptor 2 (HER2)+ (94/306, 30.7%) profiles. Most patients presented with T2 (185/306, 60.5%), N1 (142/306, 46.4%), and M0 (295/306, 96.4%) staging (TNM meaning “tumor, node, metastasis”), with 17.6% (54/306) experiencing disease progression during a median follow-up of 25.9 months (IQR 17.2-36.3). External validation using Duke (N=94) and SEER (N=2760) cohorts confirmed consistent patterns in age (40-60 years: 59/94, 63%, vs 1480/2760, 53.6%), HER2+ rates (26/94, 28%, vs 935/2760, 33.9%), and invasive ductal carcinoma prevalence (89/94, 95%, vs 2506/2760, 90.8%). In the internal cohort, the RSF achieved significantly higher time-dependent AUCs compared to Cox regression at 1-year (0.811 vs 0.763), 3-year (0.834 vs 0.783), and 5-year (0.810 vs 0.771) intervals (overall C-index: 0.803, 95% CI 0.747-0.859, vs 0.736, 95% CI 0.673-0.799). External validation confirmed robust generalizability: the Duke cohort showed 1-, 3-, and 5-year AUCs of 0.912, 0.803, and 0.776, respectively, while the SEER cohort maintained consistent performance with AUCs of 0.771, 0.729, and 0.702, respectively. Risk stratification using the RSF identified 25.8% (79/306) high-risk patients and a significantly reduced survival time (P&amp;lt;.001). Notably, the RSF maintained improved net benefits across decision thresholds in decision curve analysis (DCA); similar results were observed in external studies. The RSF model also showed promising performance across different molecular subtypes in all datasets. Based on the RSF predicted scores, patients were stratified into high- and low-risk groups, with notably poorer survival outcomes observed in the high-risk group compared to the low-risk group.\nConclusions: The RSF model, based solely on clinicopathological variables, provides a promising tool for identifying high-risk patients with breast cancer post-NAC. This approach may facilitate personalized treatment strategies and improve patient management in clinical practice.","container-title":"Journal of Medical Internet Research","DOI":"10.2196/69864","issue":"1","language":"EN","page":"e69864","publisher":"JMIR Publications Inc., Toronto, Canada","source":"www.jmir.org","title":"Comparing Random Survival Forests and Cox Regression for Nonresponders to Neoadjuvant Chemotherapy Among Patients With Breast Cancer: Multicenter Retrospective Cohort Study","title-short":"Comparing Random Survival Forests and Cox Regression for Nonresponders to Neoadjuvant Chemotherapy Among Patients With Breast Cancer","volume":"27","author":[{"family":"Jin","given":"Yudi"},{"family":"Zhao","given":"Min"},{"family":"Su","given":"Tong"},{"family":"Fan","given":"Yanjia"},{"family":"Ouyang","given":"Zubin"},{"family":"Lv","given":"Fajin"}],"issued":{"date-parts":[["2025",4,8]]}}}],"schema":"https://github.com/citation-style-language/schema/raw/master/csl-citation.json"} </w:instrText>
       </w:r>
       <w:r>
         <w:rPr>
@@ -10978,15 +10905,13 @@
         <w:t>: 0.803 vs. 0.736)</w:t>
       </w:r>
       <w:r>
-        <w:t xml:space="preserve"> para datos de </w:t>
-      </w:r>
-      <w:proofErr w:type="spellStart"/>
-      <w:r>
-        <w:t>cancer</w:t>
-      </w:r>
-      <w:proofErr w:type="spellEnd"/>
-      <w:r>
-        <w:t xml:space="preserve"> de mama.</w:t>
+        <w:t xml:space="preserve"> para datos de c</w:t>
+      </w:r>
+      <w:r>
+        <w:t>á</w:t>
+      </w:r>
+      <w:r>
+        <w:t>ncer de mama.</w:t>
       </w:r>
     </w:p>
     <w:p>
@@ -11061,57 +10986,73 @@
       </w:r>
       <w:proofErr w:type="spellEnd"/>
       <w:r>
-        <w:t xml:space="preserve"> que construye modelos predictivos mediante la combinación secuencial de modelos simples, donde cada iteración busca corregir los errores de las anteriores. En el contexto del análisis de supervivencia, este enfoque puede adaptarse para optimizar funciones de pérdida específicas del problema, como la asociada al modelo de riesgos proporcionales de Cox o métricas de concordancia</w:t>
-      </w:r>
-      <w:r>
+        <w:t xml:space="preserve"> que construye modelos predictivos mediante la combinación secuencial de modelos simples, donde cada iteración busca corregir los errores de las anteriores. En el contexto del análisis de supervivencia, este enfoque puede adaptarse para optimizar funciones de pérdida específicas del problema, como la asociada al modelo de riesgos proporcionales de Cox o métricas de concordancia </w:t>
+      </w:r>
+      <w:r>
+        <w:fldChar w:fldCharType="begin"/>
+      </w:r>
+      <w:r>
+        <w:instrText xml:space="preserve"> ADDIN ZOTERO_ITEM CSL_CITATION {"citationID":"2TTytmi1","properties":{"unsorted":false,"formattedCitation":"(Chen et\\uc0\\u160{}al. 2013)","plainCitation":"(Chen et al. 2013)","noteIndex":0},"citationItems":[{"id":179,"uris":["http://zotero.org/users/19775897/items/BPIPA5QS"],"itemData":{"id":179,"type":"article-journal","abstract":"Survival analysis focuses on modeling and predicting the time to an event of interest. Many statistical models have been proposed for survival analysis. They often impose strong assumptions on hazard functions, which describe how the risk of an event changes over time depending on covariates associated with each individual. In particular, the prevalent proportional hazards model assumes that covariates are multiplicatively related to the hazard. Here we propose a nonparametric model for survival analysis that does not explicitly assume particular forms of hazard functions. Our nonparametric model utilizes an ensemble of regression trees to determine how the hazard function varies according to the associated covariates. The ensemble model is trained using a gradient boosting method to optimize a smoothed approximation of the concordance index, which is one of the most widely used metrics in survival model performance evaluation. We implemented our model in a software package called GBMCI (gradient boosting machine for concordance index) and benchmarked the performance of our model against other popular survival models with a large-scale breast cancer prognosis dataset. Our experiment shows that GBMCI consistently outperforms other methods based on a number of covariate settings. GBMCI is implemented in R and is freely available online.","container-title":"Computational and Mathematical Methods in Medicine","DOI":"10.1155/2013/873595","ISSN":"1748-6718","issue":"1","language":"en","license":"Copyright © 2013 Yifei Chen et al.","note":"_eprint: https://onlinelibrary.wiley.com/doi/pdf/10.1155/2013/873595","page":"873595","source":"Wiley Online Library","title":"A Gradient Boosting Algorithm for Survival Analysis via Direct Optimization of Concordance Index","volume":"2013","author":[{"family":"Chen","given":"Yifei"},{"family":"Jia","given":"Zhenyu"},{"family":"Mercola","given":"Dan"},{"family":"Xie","given":"Xiaohui"}],"issued":{"date-parts":[["2013"]]}}}],"schema":"https://github.com/citation-style-language/schema/raw/master/csl-citation.json"} </w:instrText>
+      </w:r>
+      <w:r>
+        <w:fldChar w:fldCharType="separate"/>
+      </w:r>
+      <w:r>
+        <w:rPr>
+          <w:rFonts w:ascii="Calibri" w:hAnsi="Calibri" w:cs="Calibri"/>
+          <w:szCs w:val="24"/>
+        </w:rPr>
+        <w:t>(Chen et al. 2013)</w:t>
+      </w:r>
+      <w:r>
+        <w:fldChar w:fldCharType="end"/>
+      </w:r>
+      <w:r>
+        <w:t xml:space="preserve">. Este enfoque combina la capacidad del </w:t>
+      </w:r>
+      <w:proofErr w:type="spellStart"/>
+      <w:r>
+        <w:rPr>
+          <w:rStyle w:val="nfasis"/>
+        </w:rPr>
+        <w:t>boosting</w:t>
+      </w:r>
+      <w:proofErr w:type="spellEnd"/>
+      <w:r>
+        <w:t xml:space="preserve"> para manejar conjuntos de datos de alta dimensionalidad con la relativa interpretabilidad del marco de Cox. Aunque su rendimiento puede ser </w:t>
+      </w:r>
+      <w:r>
+        <w:t xml:space="preserve">comparable o superior </w:t>
+      </w:r>
+      <w:r>
+        <w:t xml:space="preserve">al de métodos basados en árboles como </w:t>
+      </w:r>
+      <w:proofErr w:type="spellStart"/>
+      <w:r>
+        <w:rPr>
+          <w:rStyle w:val="nfasis"/>
+        </w:rPr>
+        <w:t>Random</w:t>
+      </w:r>
+      <w:proofErr w:type="spellEnd"/>
+      <w:r>
+        <w:rPr>
+          <w:rStyle w:val="nfasis"/>
+        </w:rPr>
         <w:t xml:space="preserve"> </w:t>
       </w:r>
-      <w:r>
-        <w:t xml:space="preserve">(Chen et al., 2013). Este enfoque combina la capacidad del </w:t>
-      </w:r>
       <w:proofErr w:type="spellStart"/>
       <w:r>
         <w:rPr>
           <w:rStyle w:val="nfasis"/>
         </w:rPr>
-        <w:t>boosting</w:t>
-      </w:r>
-      <w:proofErr w:type="spellEnd"/>
-      <w:r>
-        <w:t xml:space="preserve"> para manejar conjuntos de datos de alta dimensionalidad con la relativa interpretabilidad del marco de Cox. Aunque su rendimiento puede ser </w:t>
-      </w:r>
-      <w:r>
-        <w:t xml:space="preserve">comparable o superior </w:t>
-      </w:r>
-      <w:r>
-        <w:t xml:space="preserve">al de métodos basados en árboles como </w:t>
-      </w:r>
-      <w:proofErr w:type="spellStart"/>
+        <w:t>Survival</w:t>
+      </w:r>
+      <w:proofErr w:type="spellEnd"/>
       <w:r>
         <w:rPr>
           <w:rStyle w:val="nfasis"/>
         </w:rPr>
-        <w:t>Random</w:t>
-      </w:r>
-      <w:proofErr w:type="spellEnd"/>
-      <w:r>
-        <w:rPr>
-          <w:rStyle w:val="nfasis"/>
-        </w:rPr>
-        <w:t xml:space="preserve"> </w:t>
-      </w:r>
-      <w:proofErr w:type="spellStart"/>
-      <w:r>
-        <w:rPr>
-          <w:rStyle w:val="nfasis"/>
-        </w:rPr>
-        <w:t>Survival</w:t>
-      </w:r>
-      <w:proofErr w:type="spellEnd"/>
-      <w:r>
-        <w:rPr>
-          <w:rStyle w:val="nfasis"/>
-        </w:rPr>
         <w:t xml:space="preserve"> Forest</w:t>
       </w:r>
       <w:r>
@@ -11121,7 +11062,26 @@
         <w:t xml:space="preserve">debido al enorme costo computacional </w:t>
       </w:r>
       <w:r>
-        <w:t>(Wang et al., 2019).</w:t>
+        <w:fldChar w:fldCharType="begin"/>
+      </w:r>
+      <w:r>
+        <w:instrText xml:space="preserve"> ADDIN ZOTERO_ITEM CSL_CITATION {"citationID":"WLFLKyER","properties":{"unsorted":false,"formattedCitation":"(Wang et\\uc0\\u160{}al. 2019)","plainCitation":"(Wang et al. 2019)","noteIndex":0},"citationItems":[{"id":81,"uris":["http://zotero.org/users/19775897/items/BVRTFI9A"],"itemData":{"id":81,"type":"article-journal","abstract":"Survival analysis is a subfield of statistics where the goal is to analyze and model data where the outcome is the time until an event of interest occurs. One of the main challenges in this context is the presence of instances whose event outcomes become unobservable after a certain time point or when some instances do not experience any event during the monitoring period. This so-called censoring can be handled most effectively using survival analysis techniques. Traditionally, statistical approaches have been widely developed in the literature to overcome the issue of censoring. In addition, many machine learning algorithms have been adapted to deal with such censored data and tackle other challenging problems that arise in real-world data. In this survey, we provide a comprehensive and structured review of the statistical methods typically used and the machine learning techniques developed for survival analysis, along with a detailed taxonomy of the existing methods. We also discuss several topics that are closely related to survival analysis and describe several successful applications in a variety of real-world application domains. We hope that this article will give readers a more comprehensive understanding of recent advances in survival analysis and offer some guidelines for applying these approaches to solve new problems arising in applications involving censored data.","container-title":"ACM Comput. Surv.","DOI":"10.1145/3214306","ISSN":"0360-0300","issue":"6","page":"110:1–110:36","source":"ACM Digital Library","title":"Machine Learning for Survival Analysis: A Survey","title-short":"Machine Learning for Survival Analysis","volume":"51","author":[{"family":"Wang","given":"Ping"},{"family":"Li","given":"Yan"},{"family":"Reddy","given":"Chandan K."}],"issued":{"date-parts":[["2019",2,27]]}}}],"schema":"https://github.com/citation-style-language/schema/raw/master/csl-citation.json"} </w:instrText>
+      </w:r>
+      <w:r>
+        <w:fldChar w:fldCharType="separate"/>
+      </w:r>
+      <w:r>
+        <w:rPr>
+          <w:rFonts w:ascii="Calibri" w:hAnsi="Calibri" w:cs="Calibri"/>
+          <w:szCs w:val="24"/>
+        </w:rPr>
+        <w:t>(Wang et al. 2019)</w:t>
+      </w:r>
+      <w:r>
+        <w:fldChar w:fldCharType="end"/>
+      </w:r>
+      <w:r>
+        <w:t>.</w:t>
       </w:r>
     </w:p>
     <w:p>
@@ -11166,134 +11126,530 @@
     <w:p>
       <w:pPr>
         <w:spacing w:after="160"/>
+        <w:rPr>
+          <w:rFonts w:cstheme="minorHAnsi"/>
+          <w:szCs w:val="24"/>
+        </w:rPr>
       </w:pPr>
-      <w:proofErr w:type="spellStart"/>
-      <w:r>
-        <w:rPr>
-          <w:rFonts w:ascii="Arial" w:hAnsi="Arial"/>
-          <w:sz w:val="22"/>
+      <w:r>
+        <w:rPr>
+          <w:rFonts w:cstheme="minorHAnsi"/>
+          <w:szCs w:val="24"/>
+        </w:rPr>
+        <w:t xml:space="preserve">El modelo </w:t>
+      </w:r>
+      <w:proofErr w:type="spellStart"/>
+      <w:r>
+        <w:rPr>
+          <w:rFonts w:cstheme="minorHAnsi"/>
+          <w:szCs w:val="24"/>
         </w:rPr>
         <w:t>DeepSurv</w:t>
       </w:r>
       <w:proofErr w:type="spellEnd"/>
       <w:r>
         <w:rPr>
-          <w:rFonts w:ascii="Arial" w:hAnsi="Arial"/>
-          <w:sz w:val="22"/>
-        </w:rPr>
-        <w:t xml:space="preserve"> [13], el modelo de aprendizaje profundo más citado en el campo, implementa una red neuronal profunda </w:t>
-      </w:r>
-      <w:proofErr w:type="spellStart"/>
-      <w:r>
-        <w:rPr>
-          <w:rFonts w:ascii="Arial" w:hAnsi="Arial"/>
-          <w:sz w:val="22"/>
+          <w:rFonts w:cstheme="minorHAnsi"/>
+          <w:szCs w:val="24"/>
+        </w:rPr>
+        <w:t xml:space="preserve">, propuesto por </w:t>
+      </w:r>
+      <w:r>
+        <w:rPr>
+          <w:rFonts w:cstheme="minorHAnsi"/>
+          <w:szCs w:val="24"/>
+        </w:rPr>
+        <w:fldChar w:fldCharType="begin"/>
+      </w:r>
+      <w:r>
+        <w:rPr>
+          <w:rFonts w:cstheme="minorHAnsi"/>
+          <w:szCs w:val="24"/>
+        </w:rPr>
+        <w:instrText xml:space="preserve"> ADDIN ZOTERO_ITEM CSL_CITATION {"citationID":"ksgEAhXf","properties":{"unsorted":false,"formattedCitation":"(Katzman et\\uc0\\u160{}al. 2018)","plainCitation":"(Katzman et al. 2018)","noteIndex":0},"citationItems":[{"id":22,"uris":["http://zotero.org/users/19775897/items/ZQLZDRDV"],"itemData":{"id":22,"type":"article-journal","abstract":"Medical practitioners use survival models to explore and understand the relationships between patients’ covariates (e.g. clinical and genetic features) and the effectiveness of various treatment options. Standard survival models like the linear Cox proportional hazards model require extensive feature engineering or prior medical knowledge to model treatment interaction at an individual level. While nonlinear survival methods, such as neural networks and survival forests, can inherently model these high-level interaction terms, they have yet to be shown as effective treatment recommender systems.","container-title":"BMC Medical Research Methodology","DOI":"10.1186/s12874-018-0482-1","ISSN":"1471-2288","issue":"1","journalAbbreviation":"BMC Med Res Methodol","language":"en","page":"24","source":"Springer Link","title":"DeepSurv: personalized treatment recommender system using a Cox proportional hazards deep neural network","title-short":"DeepSurv","volume":"18","author":[{"family":"Katzman","given":"Jared L."},{"family":"Shaham","given":"Uri"},{"family":"Cloninger","given":"Alexander"},{"family":"Bates","given":"Jonathan"},{"family":"Jiang","given":"Tingting"},{"family":"Kluger","given":"Yuval"}],"issued":{"date-parts":[["2018",2,26]]}}}],"schema":"https://github.com/citation-style-language/schema/raw/master/csl-citation.json"} </w:instrText>
+      </w:r>
+      <w:r>
+        <w:rPr>
+          <w:rFonts w:cstheme="minorHAnsi"/>
+          <w:szCs w:val="24"/>
+        </w:rPr>
+        <w:fldChar w:fldCharType="separate"/>
+      </w:r>
+      <w:proofErr w:type="spellStart"/>
+      <w:r>
+        <w:rPr>
+          <w:rFonts w:ascii="Calibri" w:hAnsi="Calibri" w:cs="Calibri"/>
+          <w:szCs w:val="24"/>
+        </w:rPr>
+        <w:t>Katzman</w:t>
+      </w:r>
+      <w:proofErr w:type="spellEnd"/>
+      <w:r>
+        <w:rPr>
+          <w:rFonts w:ascii="Calibri" w:hAnsi="Calibri" w:cs="Calibri"/>
+          <w:szCs w:val="24"/>
+        </w:rPr>
+        <w:t xml:space="preserve"> et al. </w:t>
+      </w:r>
+      <w:r>
+        <w:rPr>
+          <w:rFonts w:ascii="Calibri" w:hAnsi="Calibri" w:cs="Calibri"/>
+          <w:szCs w:val="24"/>
+        </w:rPr>
+        <w:t xml:space="preserve">en </w:t>
+      </w:r>
+      <w:r>
+        <w:rPr>
+          <w:rFonts w:ascii="Calibri" w:hAnsi="Calibri" w:cs="Calibri"/>
+          <w:szCs w:val="24"/>
+        </w:rPr>
+        <w:t>2018</w:t>
+      </w:r>
+      <w:r>
+        <w:rPr>
+          <w:rFonts w:cstheme="minorHAnsi"/>
+          <w:szCs w:val="24"/>
+        </w:rPr>
+        <w:fldChar w:fldCharType="end"/>
+      </w:r>
+      <w:r>
+        <w:rPr>
+          <w:rFonts w:cstheme="minorHAnsi"/>
+          <w:szCs w:val="24"/>
+        </w:rPr>
+        <w:t xml:space="preserve"> </w:t>
+      </w:r>
+      <w:r>
+        <w:rPr>
+          <w:rFonts w:cstheme="minorHAnsi"/>
+          <w:szCs w:val="24"/>
+        </w:rPr>
+        <w:t>es actualmente el modelo de aprendizaje profundo más citado y adoptado en el campo del análisis de supervivencia oncológica</w:t>
+      </w:r>
+      <w:r>
+        <w:rPr>
+          <w:rFonts w:cstheme="minorHAnsi"/>
+          <w:szCs w:val="24"/>
+        </w:rPr>
+        <w:t xml:space="preserve">. </w:t>
+      </w:r>
+      <w:proofErr w:type="spellStart"/>
+      <w:r>
+        <w:rPr>
+          <w:rFonts w:cstheme="minorHAnsi"/>
+          <w:szCs w:val="24"/>
+        </w:rPr>
+        <w:t>DeepSurv</w:t>
+      </w:r>
+      <w:proofErr w:type="spellEnd"/>
+      <w:r>
+        <w:rPr>
+          <w:rFonts w:cstheme="minorHAnsi"/>
+          <w:szCs w:val="24"/>
+        </w:rPr>
+        <w:t xml:space="preserve"> </w:t>
+      </w:r>
+      <w:r>
+        <w:rPr>
+          <w:rFonts w:cstheme="minorHAnsi"/>
+          <w:szCs w:val="24"/>
+        </w:rPr>
+        <w:t xml:space="preserve">implementa una red neuronal profunda </w:t>
+      </w:r>
+      <w:proofErr w:type="spellStart"/>
+      <w:r>
+        <w:rPr>
+          <w:rFonts w:cstheme="minorHAnsi"/>
+          <w:szCs w:val="24"/>
         </w:rPr>
         <w:t>feedforward</w:t>
       </w:r>
       <w:proofErr w:type="spellEnd"/>
       <w:r>
         <w:rPr>
-          <w:rFonts w:ascii="Arial" w:hAnsi="Arial"/>
-          <w:sz w:val="22"/>
-        </w:rPr>
-        <w:t xml:space="preserve"> que optimiza la función de pérdida de log-verosimilitud parcial de Cox, extendiendo el modelo de Cox al régimen no lineal. La capa de salida es una neurona única sin activación que genera la puntuación de riesgo (log </w:t>
-      </w:r>
-      <w:proofErr w:type="spellStart"/>
-      <w:r>
-        <w:rPr>
-          <w:rFonts w:ascii="Arial" w:hAnsi="Arial"/>
-          <w:sz w:val="22"/>
+          <w:rFonts w:cstheme="minorHAnsi"/>
+          <w:szCs w:val="24"/>
+        </w:rPr>
+        <w:t xml:space="preserve"> que optimiza la función de pérdida de log-verosimilitud parcial de Cox, extendiendo el modelo de Cox al régimen no lineal. </w:t>
+      </w:r>
+      <w:r>
+        <w:rPr>
+          <w:rFonts w:cstheme="minorHAnsi"/>
+          <w:szCs w:val="24"/>
+        </w:rPr>
+        <w:t xml:space="preserve">La capa de salida es una neurona única sin función de activación que genera la puntuación de riesgo (log </w:t>
+      </w:r>
+      <w:proofErr w:type="spellStart"/>
+      <w:r>
+        <w:rPr>
+          <w:rFonts w:cstheme="minorHAnsi"/>
+          <w:szCs w:val="24"/>
         </w:rPr>
         <w:t>hazard</w:t>
       </w:r>
       <w:proofErr w:type="spellEnd"/>
       <w:r>
         <w:rPr>
-          <w:rFonts w:ascii="Arial" w:hAnsi="Arial"/>
-          <w:sz w:val="22"/>
-        </w:rPr>
-        <w:t xml:space="preserve"> ratio). En el artículo original, </w:t>
-      </w:r>
-      <w:proofErr w:type="spellStart"/>
-      <w:r>
-        <w:rPr>
-          <w:rFonts w:ascii="Arial" w:hAnsi="Arial"/>
-          <w:sz w:val="22"/>
+          <w:rFonts w:cstheme="minorHAnsi"/>
+          <w:szCs w:val="24"/>
+        </w:rPr>
+        <w:t xml:space="preserve"> ratio) para cada paciente.</w:t>
+      </w:r>
+      <w:r>
+        <w:rPr>
+          <w:rFonts w:cstheme="minorHAnsi"/>
+          <w:szCs w:val="24"/>
+        </w:rPr>
+        <w:t xml:space="preserve"> </w:t>
+      </w:r>
+      <w:r>
+        <w:rPr>
+          <w:rFonts w:cstheme="minorHAnsi"/>
+          <w:szCs w:val="24"/>
+        </w:rPr>
+        <w:t xml:space="preserve">En el artículo original, </w:t>
+      </w:r>
+      <w:proofErr w:type="spellStart"/>
+      <w:r>
+        <w:rPr>
+          <w:rFonts w:cstheme="minorHAnsi"/>
+          <w:szCs w:val="24"/>
         </w:rPr>
         <w:t>Katzman</w:t>
       </w:r>
       <w:proofErr w:type="spellEnd"/>
       <w:r>
         <w:rPr>
-          <w:rFonts w:ascii="Arial" w:hAnsi="Arial"/>
-          <w:sz w:val="22"/>
-        </w:rPr>
-        <w:t xml:space="preserve"> et al. demostraron mejoras de 1-6 puntos en C-</w:t>
-      </w:r>
-      <w:proofErr w:type="spellStart"/>
-      <w:r>
-        <w:rPr>
-          <w:rFonts w:ascii="Arial" w:hAnsi="Arial"/>
-          <w:sz w:val="22"/>
+          <w:rFonts w:cstheme="minorHAnsi"/>
+          <w:szCs w:val="24"/>
+        </w:rPr>
+        <w:t xml:space="preserve"> et al. demostraron mejoras en C-</w:t>
+      </w:r>
+      <w:proofErr w:type="spellStart"/>
+      <w:r>
+        <w:rPr>
+          <w:rFonts w:cstheme="minorHAnsi"/>
+          <w:szCs w:val="24"/>
         </w:rPr>
         <w:t>index</w:t>
       </w:r>
       <w:proofErr w:type="spellEnd"/>
       <w:r>
         <w:rPr>
-          <w:rFonts w:ascii="Arial" w:hAnsi="Arial"/>
-          <w:sz w:val="22"/>
-        </w:rPr>
-        <w:t xml:space="preserve"> respecto al Cox estándar sobre cinco </w:t>
-      </w:r>
-      <w:proofErr w:type="spellStart"/>
-      <w:r>
-        <w:rPr>
-          <w:rFonts w:ascii="Arial" w:hAnsi="Arial"/>
-          <w:sz w:val="22"/>
+          <w:rFonts w:cstheme="minorHAnsi"/>
+          <w:szCs w:val="24"/>
+        </w:rPr>
+        <w:t xml:space="preserve"> respecto al Cox estándar</w:t>
+      </w:r>
+      <w:r>
+        <w:rPr>
+          <w:rFonts w:cstheme="minorHAnsi"/>
+          <w:szCs w:val="24"/>
+        </w:rPr>
+        <w:t xml:space="preserve"> y RSF</w:t>
+      </w:r>
+      <w:r>
+        <w:rPr>
+          <w:rFonts w:cstheme="minorHAnsi"/>
+          <w:szCs w:val="24"/>
+        </w:rPr>
+        <w:t xml:space="preserve"> sobre </w:t>
+      </w:r>
+      <w:r>
+        <w:rPr>
+          <w:rFonts w:cstheme="minorHAnsi"/>
+          <w:szCs w:val="24"/>
+        </w:rPr>
+        <w:t>cuatro</w:t>
+      </w:r>
+      <w:r>
+        <w:rPr>
+          <w:rFonts w:cstheme="minorHAnsi"/>
+          <w:szCs w:val="24"/>
+        </w:rPr>
+        <w:t xml:space="preserve"> </w:t>
+      </w:r>
+      <w:proofErr w:type="spellStart"/>
+      <w:r>
+        <w:rPr>
+          <w:rFonts w:cstheme="minorHAnsi"/>
+          <w:szCs w:val="24"/>
         </w:rPr>
         <w:t>datasets</w:t>
       </w:r>
       <w:proofErr w:type="spellEnd"/>
       <w:r>
         <w:rPr>
-          <w:rFonts w:ascii="Arial" w:hAnsi="Arial"/>
-          <w:sz w:val="22"/>
-        </w:rPr>
-        <w:t xml:space="preserve"> clínicos y genómicos. Huang et al. (2020) [14] compararon </w:t>
-      </w:r>
-      <w:proofErr w:type="spellStart"/>
-      <w:r>
-        <w:rPr>
-          <w:rFonts w:ascii="Arial" w:hAnsi="Arial"/>
-          <w:sz w:val="22"/>
+          <w:rFonts w:cstheme="minorHAnsi"/>
+          <w:szCs w:val="24"/>
+        </w:rPr>
+        <w:t xml:space="preserve"> clínicos y genómicos</w:t>
+      </w:r>
+      <w:r>
+        <w:rPr>
+          <w:rFonts w:cstheme="minorHAnsi"/>
+          <w:szCs w:val="24"/>
+        </w:rPr>
+        <w:t xml:space="preserve">. </w:t>
+      </w:r>
+      <w:r>
+        <w:rPr>
+          <w:rFonts w:cstheme="minorHAnsi"/>
+          <w:szCs w:val="24"/>
+        </w:rPr>
+        <w:t xml:space="preserve">Particularmente relevante para este TFM es su evaluación sobre datos de cáncer de mama del </w:t>
+      </w:r>
+      <w:proofErr w:type="spellStart"/>
+      <w:r>
+        <w:rPr>
+          <w:rFonts w:cstheme="minorHAnsi"/>
+          <w:szCs w:val="24"/>
+        </w:rPr>
+        <w:t>dataset</w:t>
+      </w:r>
+      <w:proofErr w:type="spellEnd"/>
+      <w:r>
+        <w:rPr>
+          <w:rFonts w:cstheme="minorHAnsi"/>
+          <w:szCs w:val="24"/>
+        </w:rPr>
+        <w:t xml:space="preserve"> </w:t>
+      </w:r>
+      <w:r>
+        <w:rPr>
+          <w:rFonts w:cstheme="minorHAnsi"/>
+          <w:szCs w:val="24"/>
+        </w:rPr>
+        <w:t>METABRIC</w:t>
+      </w:r>
+      <w:r>
+        <w:rPr>
+          <w:rFonts w:cstheme="minorHAnsi"/>
+          <w:szCs w:val="24"/>
+        </w:rPr>
+        <w:t xml:space="preserve"> donde </w:t>
+      </w:r>
+      <w:proofErr w:type="spellStart"/>
+      <w:r>
+        <w:rPr>
+          <w:rFonts w:cstheme="minorHAnsi"/>
+          <w:szCs w:val="24"/>
         </w:rPr>
         <w:t>DeepSurv</w:t>
       </w:r>
       <w:proofErr w:type="spellEnd"/>
       <w:r>
         <w:rPr>
-          <w:rFonts w:ascii="Arial" w:hAnsi="Arial"/>
-          <w:sz w:val="22"/>
-        </w:rPr>
-        <w:t xml:space="preserve">, RSF y Cox LASSO sobre 14 tipos de cáncer del TCGA, concluyendo que </w:t>
-      </w:r>
-      <w:proofErr w:type="spellStart"/>
-      <w:r>
-        <w:rPr>
-          <w:rFonts w:ascii="Arial" w:hAnsi="Arial"/>
-          <w:sz w:val="22"/>
+          <w:rFonts w:cstheme="minorHAnsi"/>
+          <w:szCs w:val="24"/>
+        </w:rPr>
+        <w:t xml:space="preserve"> alcanzó un C-</w:t>
+      </w:r>
+      <w:proofErr w:type="spellStart"/>
+      <w:r>
+        <w:rPr>
+          <w:rFonts w:cstheme="minorHAnsi"/>
+          <w:szCs w:val="24"/>
+        </w:rPr>
+        <w:t>index</w:t>
+      </w:r>
+      <w:proofErr w:type="spellEnd"/>
+      <w:r>
+        <w:rPr>
+          <w:rFonts w:cstheme="minorHAnsi"/>
+          <w:szCs w:val="24"/>
+        </w:rPr>
+        <w:t xml:space="preserve"> de </w:t>
+      </w:r>
+      <w:r>
+        <w:rPr>
+          <w:rFonts w:cstheme="minorHAnsi"/>
+          <w:b/>
+          <w:bCs/>
+          <w:szCs w:val="24"/>
+        </w:rPr>
+        <w:t>0.654</w:t>
+      </w:r>
+      <w:r>
+        <w:rPr>
+          <w:rFonts w:cstheme="minorHAnsi"/>
+          <w:b/>
+          <w:bCs/>
+          <w:szCs w:val="24"/>
+        </w:rPr>
+        <w:t xml:space="preserve"> </w:t>
+      </w:r>
+      <w:r>
+        <w:rPr>
+          <w:rFonts w:cstheme="minorHAnsi"/>
+          <w:szCs w:val="24"/>
+        </w:rPr>
+        <w:t xml:space="preserve">frente a </w:t>
+      </w:r>
+      <w:r>
+        <w:rPr>
+          <w:rFonts w:cstheme="minorHAnsi"/>
+          <w:szCs w:val="24"/>
+        </w:rPr>
+        <w:t>0</w:t>
+      </w:r>
+      <w:r>
+        <w:rPr>
+          <w:rFonts w:cstheme="minorHAnsi"/>
+          <w:szCs w:val="24"/>
+        </w:rPr>
+        <w:t>.631</w:t>
+      </w:r>
+      <w:r>
+        <w:rPr>
+          <w:rFonts w:cstheme="minorHAnsi"/>
+          <w:szCs w:val="24"/>
+        </w:rPr>
+        <w:t xml:space="preserve"> </w:t>
+      </w:r>
+      <w:r>
+        <w:rPr>
+          <w:rFonts w:cstheme="minorHAnsi"/>
+          <w:szCs w:val="24"/>
+        </w:rPr>
+        <w:t>del modelo de Cox</w:t>
+      </w:r>
+      <w:r>
+        <w:rPr>
+          <w:rFonts w:cstheme="minorHAnsi"/>
+          <w:szCs w:val="24"/>
+        </w:rPr>
+        <w:t xml:space="preserve"> y frente a </w:t>
+      </w:r>
+      <w:r>
+        <w:rPr>
+          <w:rFonts w:cstheme="minorHAnsi"/>
+          <w:szCs w:val="24"/>
+        </w:rPr>
+        <w:t>0.619</w:t>
+      </w:r>
+      <w:r>
+        <w:rPr>
+          <w:rFonts w:cstheme="minorHAnsi"/>
+          <w:szCs w:val="24"/>
+        </w:rPr>
+        <w:t xml:space="preserve"> del modelo RSF</w:t>
+      </w:r>
+      <w:r>
+        <w:rPr>
+          <w:rFonts w:cstheme="minorHAnsi"/>
+          <w:szCs w:val="24"/>
+        </w:rPr>
+        <w:t xml:space="preserve">. </w:t>
+      </w:r>
+      <w:r>
+        <w:rPr>
+          <w:rFonts w:cstheme="minorHAnsi"/>
+          <w:szCs w:val="24"/>
+        </w:rPr>
+        <w:fldChar w:fldCharType="begin"/>
+      </w:r>
+      <w:r>
+        <w:rPr>
+          <w:rFonts w:cstheme="minorHAnsi"/>
+          <w:szCs w:val="24"/>
+        </w:rPr>
+        <w:instrText xml:space="preserve"> ADDIN ZOTERO_ITEM CSL_CITATION {"citationID":"zesZ2fkw","properties":{"unsorted":false,"formattedCitation":"(Huang et\\uc0\\u160{}al. 2020)","plainCitation":"(Huang et al. 2020)","noteIndex":0},"citationItems":[{"id":91,"uris":["http://zotero.org/users/19775897/items/FFSPTAAB"],"itemData":{"id":91,"type":"article-journal","abstract":"Recent advances in kernel-based Deep Learning models have introduced a new era in medical research. Originally designed for pattern recognition and image processing, Deep Learning models are now applied to survival prognosis of cancer patients. Specifically, Deep Learning versions of the Cox proportional hazards models are trained with transcriptomic data to predict survival outcomes in cancer patients.","container-title":"BMC Medical Genomics","DOI":"10.1186/s12920-020-0686-1","ISSN":"1755-8794","issue":"5","journalAbbreviation":"BMC Med Genomics","language":"en","page":"41","source":"Springer Link","title":"Deep learning-based cancer survival prognosis from RNA-seq data: approaches and evaluations","title-short":"Deep learning-based cancer survival prognosis from RNA-seq data","volume":"13","author":[{"family":"Huang","given":"Zhi"},{"family":"Johnson","given":"Travis S."},{"family":"Han","given":"Zhi"},{"family":"Helm","given":"Bryan"},{"family":"Cao","given":"Sha"},{"family":"Zhang","given":"Chi"},{"family":"Salama","given":"Paul"},{"family":"Rizkalla","given":"Maher"},{"family":"Yu","given":"Christina Y."},{"family":"Cheng","given":"Jun"},{"family":"Xiang","given":"Shunian"},{"family":"Zhan","given":"Xiaohui"},{"family":"Zhang","given":"Jie"},{"family":"Huang","given":"Kun"}],"issued":{"date-parts":[["2020",4,3]]}}}],"schema":"https://github.com/citation-style-language/schema/raw/master/csl-citation.json"} </w:instrText>
+      </w:r>
+      <w:r>
+        <w:rPr>
+          <w:rFonts w:cstheme="minorHAnsi"/>
+          <w:szCs w:val="24"/>
+        </w:rPr>
+        <w:fldChar w:fldCharType="separate"/>
+      </w:r>
+      <w:r>
+        <w:rPr>
+          <w:rFonts w:ascii="Calibri" w:hAnsi="Calibri" w:cs="Calibri"/>
+          <w:szCs w:val="24"/>
+        </w:rPr>
+        <w:t xml:space="preserve">Huang et al. </w:t>
+      </w:r>
+      <w:r>
+        <w:rPr>
+          <w:rFonts w:ascii="Calibri" w:hAnsi="Calibri" w:cs="Calibri"/>
+          <w:szCs w:val="24"/>
+        </w:rPr>
+        <w:t>(</w:t>
+      </w:r>
+      <w:r>
+        <w:rPr>
+          <w:rFonts w:ascii="Calibri" w:hAnsi="Calibri" w:cs="Calibri"/>
+          <w:szCs w:val="24"/>
+        </w:rPr>
+        <w:t>2020</w:t>
+      </w:r>
+      <w:r>
+        <w:rPr>
+          <w:rFonts w:cstheme="minorHAnsi"/>
+          <w:szCs w:val="24"/>
+        </w:rPr>
+        <w:fldChar w:fldCharType="end"/>
+      </w:r>
+      <w:r>
+        <w:rPr>
+          <w:rFonts w:cstheme="minorHAnsi"/>
+          <w:szCs w:val="24"/>
+        </w:rPr>
+        <w:t xml:space="preserve">) </w:t>
+      </w:r>
+      <w:r>
+        <w:rPr>
+          <w:rFonts w:cstheme="minorHAnsi"/>
+          <w:szCs w:val="24"/>
+        </w:rPr>
+        <w:t xml:space="preserve">compararon </w:t>
+      </w:r>
+      <w:proofErr w:type="spellStart"/>
+      <w:r>
+        <w:rPr>
+          <w:rFonts w:cstheme="minorHAnsi"/>
+          <w:szCs w:val="24"/>
         </w:rPr>
         <w:t>DeepSurv</w:t>
       </w:r>
       <w:proofErr w:type="spellEnd"/>
       <w:r>
         <w:rPr>
-          <w:rFonts w:ascii="Arial" w:hAnsi="Arial"/>
-          <w:sz w:val="22"/>
-        </w:rPr>
-        <w:t xml:space="preserve"> superaba a los otros modelos en 8 de los 14 tipos.</w:t>
+          <w:rFonts w:cstheme="minorHAnsi"/>
+          <w:szCs w:val="24"/>
+        </w:rPr>
+        <w:t xml:space="preserve">, RSF y Cox LASSO sobre </w:t>
+      </w:r>
+      <w:r>
+        <w:rPr>
+          <w:rFonts w:cstheme="minorHAnsi"/>
+          <w:szCs w:val="24"/>
+        </w:rPr>
+        <w:t>12</w:t>
+      </w:r>
+      <w:r>
+        <w:rPr>
+          <w:rFonts w:cstheme="minorHAnsi"/>
+          <w:szCs w:val="24"/>
+        </w:rPr>
+        <w:t xml:space="preserve"> tipos de cáncer del TCGA, concluyendo que </w:t>
+      </w:r>
+      <w:proofErr w:type="spellStart"/>
+      <w:r>
+        <w:rPr>
+          <w:rFonts w:cstheme="minorHAnsi"/>
+          <w:szCs w:val="24"/>
+        </w:rPr>
+        <w:t>DeepSurv</w:t>
+      </w:r>
+      <w:proofErr w:type="spellEnd"/>
+      <w:r>
+        <w:rPr>
+          <w:rFonts w:cstheme="minorHAnsi"/>
+          <w:szCs w:val="24"/>
+        </w:rPr>
+        <w:t xml:space="preserve"> obtiene mejores métricas en la mayoría de ocasiones.</w:t>
       </w:r>
     </w:p>
     <w:p>
@@ -11324,138 +11680,256 @@
       </w:pPr>
       <w:proofErr w:type="spellStart"/>
       <w:r>
+        <w:t>SurvivalNet</w:t>
+      </w:r>
+      <w:proofErr w:type="spellEnd"/>
+      <w:r>
+        <w:t xml:space="preserve">, propuesto por </w:t>
+      </w:r>
+      <w:r>
+        <w:fldChar w:fldCharType="begin"/>
+      </w:r>
+      <w:r>
+        <w:instrText xml:space="preserve"> ADDIN ZOTERO_ITEM CSL_CITATION {"citationID":"ovKJB3Ei","properties":{"unsorted":false,"formattedCitation":"(Yousefi et\\uc0\\u160{}al. 2017)","plainCitation":"(Yousefi et al. 2017)","noteIndex":0},"citationItems":[{"id":95,"uris":["http://zotero.org/users/19775897/items/J53P2BX3"],"itemData":{"id":95,"type":"article-journal","abstract":"Translating the vast data generated by genomic platforms into accurate predictions of clinical outcomes is a fundamental challenge in genomic medicine. Many prediction methods face limitations in learning from the high-dimensional profiles generated by these platforms, and rely on experts to hand-select a small number of features for training prediction models. In this paper, we demonstrate how deep learning and Bayesian optimization methods that have been remarkably successful in general high-dimensional prediction tasks can be adapted to the problem of predicting cancer outcomes. We perform an extensive comparison of Bayesian optimized deep survival models and other state of the art machine learning methods for survival analysis, and describe a framework for interpreting deep survival models using a risk backpropagation technique. Finally, we illustrate that deep survival models can successfully transfer information across diseases to improve prognostic accuracy. We provide an open-source software implementation of this framework called SurvivalNet that enables automatic training, evaluation and interpretation of deep survival models.","container-title":"Scientific Reports","DOI":"10.1038/s41598-017-11817-6","ISSN":"2045-2322","issue":"1","journalAbbreviation":"Sci Rep","language":"en","license":"2017 The Author(s)","page":"11707","publisher":"Nature Publishing Group","source":"www.nature.com","title":"Predicting clinical outcomes from large scale cancer genomic profiles with deep survival models","volume":"7","author":[{"family":"Yousefi","given":"Safoora"},{"family":"Amrollahi","given":"Fatemeh"},{"family":"Amgad","given":"Mohamed"},{"family":"Dong","given":"Chengliang"},{"family":"Lewis","given":"Joshua E."},{"family":"Song","given":"Congzheng"},{"family":"Gutman","given":"David A."},{"family":"Halani","given":"Sameer H."},{"family":"Velazquez Vega","given":"Jose Enrique"},{"family":"Brat","given":"Daniel J."},{"family":"Cooper","given":"Lee A. D."}],"issued":{"date-parts":[["2017",9,15]]}}}],"schema":"https://github.com/citation-style-language/schema/raw/master/csl-citation.json"} </w:instrText>
+      </w:r>
+      <w:r>
+        <w:fldChar w:fldCharType="separate"/>
+      </w:r>
+      <w:proofErr w:type="spellStart"/>
+      <w:r>
+        <w:rPr>
+          <w:rFonts w:ascii="Calibri" w:hAnsi="Calibri" w:cs="Calibri"/>
+          <w:szCs w:val="24"/>
+        </w:rPr>
+        <w:t>Yousefi</w:t>
+      </w:r>
+      <w:proofErr w:type="spellEnd"/>
+      <w:r>
+        <w:rPr>
+          <w:rFonts w:ascii="Calibri" w:hAnsi="Calibri" w:cs="Calibri"/>
+          <w:szCs w:val="24"/>
+        </w:rPr>
+        <w:t xml:space="preserve"> et al. </w:t>
+      </w:r>
+      <w:r>
+        <w:rPr>
+          <w:rFonts w:ascii="Calibri" w:hAnsi="Calibri" w:cs="Calibri"/>
+          <w:szCs w:val="24"/>
+        </w:rPr>
+        <w:t xml:space="preserve">en </w:t>
+      </w:r>
+      <w:r>
+        <w:rPr>
+          <w:rFonts w:ascii="Calibri" w:hAnsi="Calibri" w:cs="Calibri"/>
+          <w:szCs w:val="24"/>
+        </w:rPr>
+        <w:t>2017</w:t>
+      </w:r>
+      <w:r>
+        <w:fldChar w:fldCharType="end"/>
+      </w:r>
+      <w:r>
+        <w:t>,</w:t>
+      </w:r>
+      <w:r>
+        <w:t xml:space="preserve"> </w:t>
+      </w:r>
+      <w:r>
+        <w:t xml:space="preserve">es otro modelo de red neuronal para supervivencia que incorpora regularización mediante </w:t>
+      </w:r>
+      <w:proofErr w:type="spellStart"/>
+      <w:r>
+        <w:t>dropout</w:t>
+      </w:r>
+      <w:proofErr w:type="spellEnd"/>
+      <w:r>
+        <w:t>, normalización por lotes (</w:t>
+      </w:r>
+      <w:proofErr w:type="spellStart"/>
+      <w:r>
+        <w:t>batch</w:t>
+      </w:r>
+      <w:proofErr w:type="spellEnd"/>
+      <w:r>
+        <w:t xml:space="preserve"> </w:t>
+      </w:r>
+      <w:proofErr w:type="spellStart"/>
+      <w:r>
+        <w:t>normalization</w:t>
+      </w:r>
+      <w:proofErr w:type="spellEnd"/>
+      <w:r>
+        <w:t xml:space="preserve">) y optimización bayesiana de </w:t>
+      </w:r>
+      <w:proofErr w:type="spellStart"/>
+      <w:r>
+        <w:t>hiperparámetros</w:t>
+      </w:r>
+      <w:proofErr w:type="spellEnd"/>
+      <w:r>
+        <w:t xml:space="preserve">. Su evaluación sobre cuatro </w:t>
+      </w:r>
+      <w:proofErr w:type="spellStart"/>
+      <w:r>
+        <w:t>datasets</w:t>
+      </w:r>
+      <w:proofErr w:type="spellEnd"/>
+      <w:r>
+        <w:t xml:space="preserve"> de TCGA (glioblastoma, cáncer de mama, cáncer de riñón y cáncer de hígado) demostró mejoras sobre el modelo de Cox en todos los casos</w:t>
+      </w:r>
+      <w:r>
+        <w:t>.</w:t>
+      </w:r>
+    </w:p>
+    <w:p>
+      <w:pPr>
+        <w:spacing w:after="160"/>
+      </w:pPr>
+      <w:r>
+        <w:t xml:space="preserve">Más </w:t>
+      </w:r>
+      <w:r>
+        <w:t>recientemente</w:t>
+      </w:r>
+      <w:r>
         <w:rPr>
           <w:rFonts w:ascii="Arial" w:hAnsi="Arial"/>
           <w:sz w:val="22"/>
         </w:rPr>
-        <w:t>SurvivalNet</w:t>
-      </w:r>
-      <w:proofErr w:type="spellEnd"/>
-      <w:r>
-        <w:rPr>
-          <w:rFonts w:ascii="Arial" w:hAnsi="Arial"/>
-          <w:sz w:val="22"/>
-        </w:rPr>
-        <w:t xml:space="preserve"> [15] incorpora regularización mediante </w:t>
-      </w:r>
-      <w:proofErr w:type="spellStart"/>
-      <w:r>
-        <w:rPr>
-          <w:rFonts w:ascii="Arial" w:hAnsi="Arial"/>
-          <w:sz w:val="22"/>
-        </w:rPr>
-        <w:t>dropout</w:t>
-      </w:r>
-      <w:proofErr w:type="spellEnd"/>
-      <w:r>
-        <w:rPr>
-          <w:rFonts w:ascii="Arial" w:hAnsi="Arial"/>
-          <w:sz w:val="22"/>
-        </w:rPr>
         <w:t xml:space="preserve">, </w:t>
       </w:r>
-      <w:proofErr w:type="spellStart"/>
-      <w:r>
-        <w:rPr>
-          <w:rFonts w:ascii="Arial" w:hAnsi="Arial"/>
-          <w:sz w:val="22"/>
-        </w:rPr>
-        <w:t>batch</w:t>
-      </w:r>
-      <w:proofErr w:type="spellEnd"/>
-      <w:r>
-        <w:rPr>
-          <w:rFonts w:ascii="Arial" w:hAnsi="Arial"/>
-          <w:sz w:val="22"/>
-        </w:rPr>
+      <w:r>
+        <w:t>l</w:t>
+      </w:r>
+      <w:r>
+        <w:t xml:space="preserve">a integración de múltiples modalidades de datos genómicos mediante arquitecturas de aprendizaje profundo constituye una de las líneas de investigación más activas en el campo. </w:t>
+      </w:r>
+      <w:r>
+        <w:fldChar w:fldCharType="begin"/>
+      </w:r>
+      <w:r>
+        <w:instrText xml:space="preserve"> ADDIN ZOTERO_ITEM CSL_CITATION {"citationID":"9JDSqDpT","properties":{"unsorted":false,"formattedCitation":"(Tong et\\uc0\\u160{}al. 2020)","plainCitation":"(Tong et al. 2020)","noteIndex":0},"citationItems":[{"id":102,"uris":["http://zotero.org/users/19775897/items/Z82U38ET"],"itemData":{"id":102,"type":"article-journal","abstract":"Breast cancer is the most prevalent and among the most deadly cancers in females. Patients with breast cancer have highly variable survival lengths, indicating a need to identify prognostic biomarkers for personalized diagnosis and treatment. With the development of new technologies such as next-generation sequencing, multi-omics information are becoming available for a more thorough evaluation of a patient’s condition. In this study, we aim to improve breast cancer overall survival prediction by integrating multi-omics data (e.g., gene expression, DNA methylation, miRNA expression, and copy number variations (CNVs)).","container-title":"BMC Medical Informatics and Decision Making","DOI":"10.1186/s12911-020-01225-8","ISSN":"1472-6947","issue":"1","journalAbbreviation":"BMC Med Inform Decis Mak","language":"en","page":"225","source":"Springer Link","title":"Deep learning based feature-level integration of multi-omics data for breast cancer patients survival analysis","volume":"20","author":[{"family":"Tong","given":"Li"},{"family":"Mitchel","given":"Jonathan"},{"family":"Chatlin","given":"Kevin"},{"family":"Wang","given":"May D."}],"issued":{"date-parts":[["2020",9,15]]}}}],"schema":"https://github.com/citation-style-language/schema/raw/master/csl-citation.json"} </w:instrText>
+      </w:r>
+      <w:r>
+        <w:fldChar w:fldCharType="separate"/>
+      </w:r>
+      <w:proofErr w:type="spellStart"/>
+      <w:r>
+        <w:rPr>
+          <w:rFonts w:ascii="Calibri" w:hAnsi="Calibri" w:cs="Calibri"/>
+          <w:szCs w:val="24"/>
+        </w:rPr>
+        <w:t>Tong</w:t>
+      </w:r>
+      <w:proofErr w:type="spellEnd"/>
+      <w:r>
+        <w:rPr>
+          <w:rFonts w:ascii="Calibri" w:hAnsi="Calibri" w:cs="Calibri"/>
+          <w:szCs w:val="24"/>
+        </w:rPr>
+        <w:t xml:space="preserve"> et al. </w:t>
+      </w:r>
+      <w:r>
+        <w:rPr>
+          <w:rFonts w:ascii="Calibri" w:hAnsi="Calibri" w:cs="Calibri"/>
+          <w:szCs w:val="24"/>
+        </w:rPr>
+        <w:t>(</w:t>
+      </w:r>
+      <w:r>
+        <w:rPr>
+          <w:rFonts w:ascii="Calibri" w:hAnsi="Calibri" w:cs="Calibri"/>
+          <w:szCs w:val="24"/>
+        </w:rPr>
+        <w:t>2020)</w:t>
+      </w:r>
+      <w:r>
+        <w:fldChar w:fldCharType="end"/>
+      </w:r>
+      <w:r>
         <w:t xml:space="preserve"> </w:t>
       </w:r>
-      <w:proofErr w:type="spellStart"/>
-      <w:r>
-        <w:rPr>
-          <w:rFonts w:ascii="Arial" w:hAnsi="Arial"/>
-          <w:sz w:val="22"/>
-        </w:rPr>
-        <w:t>normalization</w:t>
-      </w:r>
-      <w:proofErr w:type="spellEnd"/>
-      <w:r>
-        <w:rPr>
-          <w:rFonts w:ascii="Arial" w:hAnsi="Arial"/>
-          <w:sz w:val="22"/>
-        </w:rPr>
-        <w:t xml:space="preserve"> y optimización bayesiana de </w:t>
-      </w:r>
-      <w:proofErr w:type="spellStart"/>
-      <w:r>
-        <w:rPr>
-          <w:rFonts w:ascii="Arial" w:hAnsi="Arial"/>
-          <w:sz w:val="22"/>
-        </w:rPr>
-        <w:t>hiperparámetros</w:t>
-      </w:r>
-      <w:proofErr w:type="spellEnd"/>
-      <w:r>
-        <w:rPr>
-          <w:rFonts w:ascii="Arial" w:hAnsi="Arial"/>
-          <w:sz w:val="22"/>
-        </w:rPr>
-        <w:t xml:space="preserve">, con resultados superiores al Cox penalizado en cuatro </w:t>
-      </w:r>
-      <w:proofErr w:type="spellStart"/>
-      <w:r>
-        <w:rPr>
-          <w:rFonts w:ascii="Arial" w:hAnsi="Arial"/>
-          <w:sz w:val="22"/>
-        </w:rPr>
-        <w:t>datasets</w:t>
-      </w:r>
-      <w:proofErr w:type="spellEnd"/>
-      <w:r>
-        <w:rPr>
-          <w:rFonts w:ascii="Arial" w:hAnsi="Arial"/>
-          <w:sz w:val="22"/>
-        </w:rPr>
-        <w:t xml:space="preserve"> de TCGA. Arquitecturas basadas en </w:t>
-      </w:r>
-      <w:proofErr w:type="spellStart"/>
-      <w:r>
-        <w:rPr>
-          <w:rFonts w:ascii="Arial" w:hAnsi="Arial"/>
-          <w:sz w:val="22"/>
-        </w:rPr>
-        <w:t>transformers</w:t>
-      </w:r>
-      <w:proofErr w:type="spellEnd"/>
-      <w:r>
-        <w:rPr>
-          <w:rFonts w:ascii="Arial" w:hAnsi="Arial"/>
-          <w:sz w:val="22"/>
-        </w:rPr>
-        <w:t xml:space="preserve"> y mecanismos de atención [16] han demostrado mejoras de hasta 8 puntos porcentuales en C-</w:t>
-      </w:r>
-      <w:proofErr w:type="spellStart"/>
-      <w:r>
-        <w:rPr>
-          <w:rFonts w:ascii="Arial" w:hAnsi="Arial"/>
-          <w:sz w:val="22"/>
-        </w:rPr>
+      <w:r>
+        <w:t xml:space="preserve">propusieron el </w:t>
+      </w:r>
+      <w:proofErr w:type="spellStart"/>
+      <w:r>
+        <w:t>framework</w:t>
+      </w:r>
+      <w:proofErr w:type="spellEnd"/>
+      <w:r>
+        <w:t xml:space="preserve"> DCAP (Deep </w:t>
+      </w:r>
+      <w:proofErr w:type="spellStart"/>
+      <w:r>
+        <w:t>Cancer</w:t>
+      </w:r>
+      <w:proofErr w:type="spellEnd"/>
+      <w:r>
+        <w:t xml:space="preserve"> Prognosis), basado en un </w:t>
+      </w:r>
+      <w:proofErr w:type="spellStart"/>
+      <w:r>
+        <w:t>encoder</w:t>
+      </w:r>
+      <w:proofErr w:type="spellEnd"/>
+      <w:r>
+        <w:t xml:space="preserve"> por modalidad (expresión génica, </w:t>
+      </w:r>
+      <w:proofErr w:type="spellStart"/>
+      <w:r>
+        <w:t>miRNA</w:t>
+      </w:r>
+      <w:proofErr w:type="spellEnd"/>
+      <w:r>
+        <w:t xml:space="preserve">, metilación, CNV) seguido de una capa de fusión de características de nivel profundo. Evaluado sobre </w:t>
+      </w:r>
+      <w:r>
+        <w:t xml:space="preserve">datos simulados de MNIST y datos </w:t>
+      </w:r>
+      <w:proofErr w:type="spellStart"/>
+      <w:r>
+        <w:t>multi-omicos</w:t>
+      </w:r>
+      <w:proofErr w:type="spellEnd"/>
+      <w:r>
+        <w:t xml:space="preserve"> de</w:t>
+      </w:r>
+      <w:r>
+        <w:t xml:space="preserve"> TCGA</w:t>
+      </w:r>
+      <w:r>
+        <w:t>-BRCA</w:t>
+      </w:r>
+      <w:r>
+        <w:t xml:space="preserve">, DCAP </w:t>
+      </w:r>
+      <w:r>
+        <w:t xml:space="preserve">superó a los modelos de una sola modalidad </w:t>
+      </w:r>
+      <w:r>
+        <w:t>en C-</w:t>
+      </w:r>
+      <w:proofErr w:type="spellStart"/>
+      <w:r>
         <w:t>index</w:t>
       </w:r>
       <w:proofErr w:type="spellEnd"/>
       <w:r>
-        <w:rPr>
-          <w:rFonts w:ascii="Arial" w:hAnsi="Arial"/>
-          <w:sz w:val="22"/>
-        </w:rPr>
-        <w:t>, aunque su aplicabilidad práctica queda limitada por los requisitos de tamaño muestral (n &gt;&gt; 1.000 por tipo de cáncer). Chen et al. (2021) [18] demostraron con el modelo PORPOISE que la fusión de expresión génica e histopatología supera sistemáticamente a los modelos unimodales, con mejoras de hasta 12 puntos porcentuales en tipos con alta heterogeneidad histológica.</w:t>
-      </w:r>
+        <w:t xml:space="preserve"> respecto al uso de expresión génica aislada, con la contribución de cada modalidad variando por tipo de cáncer.</w:t>
+      </w:r>
+    </w:p>
+    <w:p>
+      <w:pPr>
+        <w:spacing w:after="160"/>
+      </w:pPr>
     </w:p>
     <w:p>
       <w:pPr>
         <w:pStyle w:val="Ttulo3"/>
       </w:pPr>
       <w:r>
+        <w:lastRenderedPageBreak/>
         <w:t>2.</w:t>
       </w:r>
       <w:r>
@@ -11491,7 +11965,6 @@
         <w:rPr>
           <w:noProof/>
         </w:rPr>
-        <w:lastRenderedPageBreak/>
         <w:drawing>
           <wp:inline distT="0" distB="0" distL="0" distR="0" wp14:anchorId="7815F95A" wp14:editId="7E0BF4D1">
             <wp:extent cx="5619750" cy="2400300"/>
@@ -11539,14 +12012,27 @@
       <w:r>
         <w:t xml:space="preserve">Figura </w:t>
       </w:r>
-      <w:fldSimple w:instr=" SEQ Figura \* ARABIC ">
-        <w:r>
-          <w:rPr>
-            <w:noProof/>
-          </w:rPr>
-          <w:t>2</w:t>
-        </w:r>
-      </w:fldSimple>
+      <w:r>
+        <w:fldChar w:fldCharType="begin"/>
+      </w:r>
+      <w:r>
+        <w:instrText xml:space="preserve"> SEQ Figura \* ARABIC </w:instrText>
+      </w:r>
+      <w:r>
+        <w:fldChar w:fldCharType="separate"/>
+      </w:r>
+      <w:r>
+        <w:rPr>
+          <w:noProof/>
+        </w:rPr>
+        <w:t>2</w:t>
+      </w:r>
+      <w:r>
+        <w:rPr>
+          <w:noProof/>
+        </w:rPr>
+        <w:fldChar w:fldCharType="end"/>
+      </w:r>
       <w:r>
         <w:t xml:space="preserve">. </w:t>
       </w:r>
@@ -11607,102 +12093,1389 @@
     </w:p>
     <w:p>
       <w:pPr>
+        <w:spacing w:before="100" w:beforeAutospacing="1" w:after="100" w:afterAutospacing="1"/>
+        <w:rPr>
+          <w:rFonts w:eastAsia="Times New Roman" w:cstheme="minorHAnsi"/>
+          <w:szCs w:val="24"/>
+        </w:rPr>
+      </w:pPr>
+      <w:r>
+        <w:rPr>
+          <w:rFonts w:eastAsia="Times New Roman" w:cstheme="minorHAnsi"/>
+          <w:szCs w:val="24"/>
+        </w:rPr>
+        <w:t xml:space="preserve">El proyecto </w:t>
+      </w:r>
+      <w:proofErr w:type="spellStart"/>
+      <w:r>
+        <w:rPr>
+          <w:rFonts w:eastAsia="Times New Roman" w:cstheme="minorHAnsi"/>
+          <w:szCs w:val="24"/>
+        </w:rPr>
+        <w:t>The</w:t>
+      </w:r>
+      <w:proofErr w:type="spellEnd"/>
+      <w:r>
+        <w:rPr>
+          <w:rFonts w:eastAsia="Times New Roman" w:cstheme="minorHAnsi"/>
+          <w:szCs w:val="24"/>
+        </w:rPr>
+        <w:t xml:space="preserve"> </w:t>
+      </w:r>
+      <w:proofErr w:type="spellStart"/>
+      <w:r>
+        <w:rPr>
+          <w:rFonts w:eastAsia="Times New Roman" w:cstheme="minorHAnsi"/>
+          <w:szCs w:val="24"/>
+        </w:rPr>
+        <w:t>Cancer</w:t>
+      </w:r>
+      <w:proofErr w:type="spellEnd"/>
+      <w:r>
+        <w:rPr>
+          <w:rFonts w:eastAsia="Times New Roman" w:cstheme="minorHAnsi"/>
+          <w:szCs w:val="24"/>
+        </w:rPr>
+        <w:t xml:space="preserve"> </w:t>
+      </w:r>
+      <w:proofErr w:type="spellStart"/>
+      <w:r>
+        <w:rPr>
+          <w:rFonts w:eastAsia="Times New Roman" w:cstheme="minorHAnsi"/>
+          <w:szCs w:val="24"/>
+        </w:rPr>
+        <w:t>Genome</w:t>
+      </w:r>
+      <w:proofErr w:type="spellEnd"/>
+      <w:r>
+        <w:rPr>
+          <w:rFonts w:eastAsia="Times New Roman" w:cstheme="minorHAnsi"/>
+          <w:szCs w:val="24"/>
+        </w:rPr>
+        <w:t xml:space="preserve"> Atlas (TCGA), lanzado en 2006 por el </w:t>
+      </w:r>
+      <w:proofErr w:type="spellStart"/>
+      <w:r>
+        <w:rPr>
+          <w:rFonts w:eastAsia="Times New Roman" w:cstheme="minorHAnsi"/>
+          <w:i/>
+          <w:iCs/>
+          <w:szCs w:val="24"/>
+        </w:rPr>
+        <w:t>National</w:t>
+      </w:r>
+      <w:proofErr w:type="spellEnd"/>
+      <w:r>
+        <w:rPr>
+          <w:rFonts w:eastAsia="Times New Roman" w:cstheme="minorHAnsi"/>
+          <w:i/>
+          <w:iCs/>
+          <w:szCs w:val="24"/>
+        </w:rPr>
+        <w:t xml:space="preserve"> </w:t>
+      </w:r>
+      <w:proofErr w:type="spellStart"/>
+      <w:r>
+        <w:rPr>
+          <w:rFonts w:eastAsia="Times New Roman" w:cstheme="minorHAnsi"/>
+          <w:i/>
+          <w:iCs/>
+          <w:szCs w:val="24"/>
+        </w:rPr>
+        <w:t>Cancer</w:t>
+      </w:r>
+      <w:proofErr w:type="spellEnd"/>
+      <w:r>
+        <w:rPr>
+          <w:rFonts w:eastAsia="Times New Roman" w:cstheme="minorHAnsi"/>
+          <w:i/>
+          <w:iCs/>
+          <w:szCs w:val="24"/>
+        </w:rPr>
+        <w:t xml:space="preserve"> </w:t>
+      </w:r>
+      <w:proofErr w:type="spellStart"/>
+      <w:r>
+        <w:rPr>
+          <w:rFonts w:eastAsia="Times New Roman" w:cstheme="minorHAnsi"/>
+          <w:i/>
+          <w:iCs/>
+          <w:szCs w:val="24"/>
+        </w:rPr>
+        <w:t>Institute</w:t>
+      </w:r>
+      <w:proofErr w:type="spellEnd"/>
+      <w:r>
+        <w:rPr>
+          <w:rFonts w:eastAsia="Times New Roman" w:cstheme="minorHAnsi"/>
+          <w:i/>
+          <w:iCs/>
+          <w:szCs w:val="24"/>
+        </w:rPr>
+        <w:t xml:space="preserve"> (NCI)</w:t>
+      </w:r>
+      <w:r>
+        <w:rPr>
+          <w:rFonts w:eastAsia="Times New Roman" w:cstheme="minorHAnsi"/>
+          <w:szCs w:val="24"/>
+        </w:rPr>
+        <w:t xml:space="preserve"> y el </w:t>
+      </w:r>
+      <w:proofErr w:type="spellStart"/>
+      <w:r>
+        <w:rPr>
+          <w:rFonts w:eastAsia="Times New Roman" w:cstheme="minorHAnsi"/>
+          <w:i/>
+          <w:iCs/>
+          <w:szCs w:val="24"/>
+        </w:rPr>
+        <w:t>National</w:t>
+      </w:r>
+      <w:proofErr w:type="spellEnd"/>
+      <w:r>
+        <w:rPr>
+          <w:rFonts w:eastAsia="Times New Roman" w:cstheme="minorHAnsi"/>
+          <w:i/>
+          <w:iCs/>
+          <w:szCs w:val="24"/>
+        </w:rPr>
+        <w:t xml:space="preserve"> Human </w:t>
+      </w:r>
+      <w:proofErr w:type="spellStart"/>
+      <w:r>
+        <w:rPr>
+          <w:rFonts w:eastAsia="Times New Roman" w:cstheme="minorHAnsi"/>
+          <w:i/>
+          <w:iCs/>
+          <w:szCs w:val="24"/>
+        </w:rPr>
+        <w:t>Genome</w:t>
+      </w:r>
+      <w:proofErr w:type="spellEnd"/>
+      <w:r>
+        <w:rPr>
+          <w:rFonts w:eastAsia="Times New Roman" w:cstheme="minorHAnsi"/>
+          <w:i/>
+          <w:iCs/>
+          <w:szCs w:val="24"/>
+        </w:rPr>
+        <w:t xml:space="preserve"> </w:t>
+      </w:r>
+      <w:proofErr w:type="spellStart"/>
+      <w:r>
+        <w:rPr>
+          <w:rFonts w:eastAsia="Times New Roman" w:cstheme="minorHAnsi"/>
+          <w:i/>
+          <w:iCs/>
+          <w:szCs w:val="24"/>
+        </w:rPr>
+        <w:t>Research</w:t>
+      </w:r>
+      <w:proofErr w:type="spellEnd"/>
+      <w:r>
+        <w:rPr>
+          <w:rFonts w:eastAsia="Times New Roman" w:cstheme="minorHAnsi"/>
+          <w:i/>
+          <w:iCs/>
+          <w:szCs w:val="24"/>
+        </w:rPr>
+        <w:t xml:space="preserve"> </w:t>
+      </w:r>
+      <w:proofErr w:type="spellStart"/>
+      <w:r>
+        <w:rPr>
+          <w:rFonts w:eastAsia="Times New Roman" w:cstheme="minorHAnsi"/>
+          <w:i/>
+          <w:iCs/>
+          <w:szCs w:val="24"/>
+        </w:rPr>
+        <w:t>Institute</w:t>
+      </w:r>
+      <w:proofErr w:type="spellEnd"/>
+      <w:r>
+        <w:rPr>
+          <w:rFonts w:eastAsia="Times New Roman" w:cstheme="minorHAnsi"/>
+          <w:i/>
+          <w:iCs/>
+          <w:szCs w:val="24"/>
+        </w:rPr>
+        <w:t xml:space="preserve"> (NHGRI)</w:t>
+      </w:r>
+      <w:r>
+        <w:rPr>
+          <w:rFonts w:eastAsia="Times New Roman" w:cstheme="minorHAnsi"/>
+          <w:szCs w:val="24"/>
+        </w:rPr>
+        <w:t xml:space="preserve">, ha supuesto un avance clave en la investigación oncológica traslacional. Este consorcio ha generado perfiles moleculares completos </w:t>
+      </w:r>
+      <w:r>
+        <w:rPr>
+          <w:rFonts w:eastAsia="Times New Roman" w:cstheme="minorHAnsi"/>
+          <w:szCs w:val="24"/>
+        </w:rPr>
+        <w:t>(</w:t>
+      </w:r>
+      <w:r>
+        <w:rPr>
+          <w:rFonts w:eastAsia="Times New Roman" w:cstheme="minorHAnsi"/>
+          <w:szCs w:val="24"/>
+        </w:rPr>
+        <w:t>incluyendo expresión génica mediante RNA-</w:t>
+      </w:r>
+      <w:proofErr w:type="spellStart"/>
+      <w:r>
+        <w:rPr>
+          <w:rFonts w:eastAsia="Times New Roman" w:cstheme="minorHAnsi"/>
+          <w:szCs w:val="24"/>
+        </w:rPr>
+        <w:t>seq</w:t>
+      </w:r>
+      <w:proofErr w:type="spellEnd"/>
+      <w:r>
+        <w:rPr>
+          <w:rFonts w:eastAsia="Times New Roman" w:cstheme="minorHAnsi"/>
+          <w:szCs w:val="24"/>
+        </w:rPr>
+        <w:t>, mutaciones somáticas, variaciones en el número de copias, metilación del ADN y datos proteómicos</w:t>
+      </w:r>
+      <w:r>
+        <w:rPr>
+          <w:rFonts w:eastAsia="Times New Roman" w:cstheme="minorHAnsi"/>
+          <w:szCs w:val="24"/>
+        </w:rPr>
+        <w:t>)</w:t>
+      </w:r>
+      <w:r>
+        <w:rPr>
+          <w:rFonts w:eastAsia="Times New Roman" w:cstheme="minorHAnsi"/>
+          <w:szCs w:val="24"/>
+        </w:rPr>
+        <w:t xml:space="preserve"> para más de 11.000 tumores primarios correspondientes a 33 tipos de cáncer, integrados con información clínica y de seguimiento</w:t>
+      </w:r>
+      <w:r>
+        <w:rPr>
+          <w:rFonts w:eastAsia="Times New Roman" w:cstheme="minorHAnsi"/>
+          <w:szCs w:val="24"/>
+        </w:rPr>
+        <w:t xml:space="preserve"> </w:t>
+      </w:r>
+      <w:r>
+        <w:rPr>
+          <w:rFonts w:eastAsia="Times New Roman" w:cstheme="minorHAnsi"/>
+          <w:szCs w:val="24"/>
+        </w:rPr>
+        <w:fldChar w:fldCharType="begin"/>
+      </w:r>
+      <w:r>
+        <w:rPr>
+          <w:rFonts w:eastAsia="Times New Roman" w:cstheme="minorHAnsi"/>
+          <w:szCs w:val="24"/>
+        </w:rPr>
+        <w:instrText xml:space="preserve"> ADDIN ZOTERO_ITEM CSL_CITATION {"citationID":"htUkAY6S","properties":{"unsorted":false,"formattedCitation":"(The Cancer Genome Atlas Research Network et\\uc0\\u160{}al. 2013)","plainCitation":"(The Cancer Genome Atlas Research Network et al. 2013)","noteIndex":0},"citationItems":[{"id":108,"uris":["http://zotero.org/users/19775897/items/L8DEXBHB"],"itemData":{"id":108,"type":"article-journal","container-title":"Nature Genetics","DOI":"10.1038/ng.2764","ISSN":"1061-4036, 1546-1718","issue":"10","journalAbbreviation":"Nat Genet","language":"en","license":"https://creativecommons.org/licenses/by-nc-sa/3.0/","page":"1113-1120","source":"DOI.org (Crossref)","title":"The Cancer Genome Atlas Pan-Cancer analysis project","volume":"45","author":[{"literal":"The Cancer Genome Atlas Research Network"},{"family":"Weinstein","given":"John N"},{"family":"Collisson","given":"Eric A"},{"family":"Mills","given":"Gordon B"},{"family":"Shaw","given":"Kenna R Mills"},{"family":"Ozenberger","given":"Brad A"},{"family":"Ellrott","given":"Kyle"},{"family":"Shmulevich","given":"Ilya"},{"family":"Sander","given":"Chris"},{"family":"Stuart","given":"Joshua M"}],"issued":{"date-parts":[["2013",10]]}}}],"schema":"https://github.com/citation-style-language/schema/raw/master/csl-citation.json"} </w:instrText>
+      </w:r>
+      <w:r>
+        <w:rPr>
+          <w:rFonts w:eastAsia="Times New Roman" w:cstheme="minorHAnsi"/>
+          <w:szCs w:val="24"/>
+        </w:rPr>
+        <w:fldChar w:fldCharType="separate"/>
+      </w:r>
+      <w:r>
+        <w:rPr>
+          <w:rFonts w:ascii="Calibri" w:hAnsi="Calibri" w:cs="Calibri"/>
+          <w:szCs w:val="24"/>
+        </w:rPr>
+        <w:t>(</w:t>
+      </w:r>
+      <w:proofErr w:type="spellStart"/>
+      <w:r>
+        <w:rPr>
+          <w:rFonts w:ascii="Calibri" w:hAnsi="Calibri" w:cs="Calibri"/>
+          <w:szCs w:val="24"/>
+        </w:rPr>
+        <w:t>The</w:t>
+      </w:r>
+      <w:proofErr w:type="spellEnd"/>
+      <w:r>
+        <w:rPr>
+          <w:rFonts w:ascii="Calibri" w:hAnsi="Calibri" w:cs="Calibri"/>
+          <w:szCs w:val="24"/>
+        </w:rPr>
+        <w:t xml:space="preserve"> </w:t>
+      </w:r>
+      <w:proofErr w:type="spellStart"/>
+      <w:r>
+        <w:rPr>
+          <w:rFonts w:ascii="Calibri" w:hAnsi="Calibri" w:cs="Calibri"/>
+          <w:szCs w:val="24"/>
+        </w:rPr>
+        <w:t>Cancer</w:t>
+      </w:r>
+      <w:proofErr w:type="spellEnd"/>
+      <w:r>
+        <w:rPr>
+          <w:rFonts w:ascii="Calibri" w:hAnsi="Calibri" w:cs="Calibri"/>
+          <w:szCs w:val="24"/>
+        </w:rPr>
+        <w:t xml:space="preserve"> </w:t>
+      </w:r>
+      <w:proofErr w:type="spellStart"/>
+      <w:r>
+        <w:rPr>
+          <w:rFonts w:ascii="Calibri" w:hAnsi="Calibri" w:cs="Calibri"/>
+          <w:szCs w:val="24"/>
+        </w:rPr>
+        <w:t>Genome</w:t>
+      </w:r>
+      <w:proofErr w:type="spellEnd"/>
+      <w:r>
+        <w:rPr>
+          <w:rFonts w:ascii="Calibri" w:hAnsi="Calibri" w:cs="Calibri"/>
+          <w:szCs w:val="24"/>
+        </w:rPr>
+        <w:t xml:space="preserve"> Atlas </w:t>
+      </w:r>
+      <w:proofErr w:type="spellStart"/>
+      <w:r>
+        <w:rPr>
+          <w:rFonts w:ascii="Calibri" w:hAnsi="Calibri" w:cs="Calibri"/>
+          <w:szCs w:val="24"/>
+        </w:rPr>
+        <w:t>Research</w:t>
+      </w:r>
+      <w:proofErr w:type="spellEnd"/>
+      <w:r>
+        <w:rPr>
+          <w:rFonts w:ascii="Calibri" w:hAnsi="Calibri" w:cs="Calibri"/>
+          <w:szCs w:val="24"/>
+        </w:rPr>
+        <w:t xml:space="preserve"> Network et al. 2013)</w:t>
+      </w:r>
+      <w:r>
+        <w:rPr>
+          <w:rFonts w:eastAsia="Times New Roman" w:cstheme="minorHAnsi"/>
+          <w:szCs w:val="24"/>
+        </w:rPr>
+        <w:fldChar w:fldCharType="end"/>
+      </w:r>
+      <w:r>
+        <w:rPr>
+          <w:rFonts w:eastAsia="Times New Roman" w:cstheme="minorHAnsi"/>
+          <w:szCs w:val="24"/>
+        </w:rPr>
+        <w:t xml:space="preserve">. La estandarización de los pipelines de procesamiento a través del GDC Data Portal </w:t>
+      </w:r>
+      <w:r>
+        <w:rPr>
+          <w:rFonts w:eastAsia="Times New Roman" w:cstheme="minorHAnsi"/>
+          <w:szCs w:val="24"/>
+        </w:rPr>
+        <w:fldChar w:fldCharType="begin"/>
+      </w:r>
+      <w:r>
+        <w:rPr>
+          <w:rFonts w:eastAsia="Times New Roman" w:cstheme="minorHAnsi"/>
+          <w:szCs w:val="24"/>
+        </w:rPr>
+        <w:instrText xml:space="preserve"> ADDIN ZOTERO_ITEM CSL_CITATION {"citationID":"TaWZ0Chb","properties":{"unsorted":false,"formattedCitation":"(Jensen et\\uc0\\u160{}al. 2017)","plainCitation":"(Jensen et al. 2017)","noteIndex":0},"citationItems":[{"id":189,"uris":["http://zotero.org/users/19775897/items/66A46MTG"],"itemData":{"id":189,"type":"article-journal","abstract":"The National Cancer Institute Genomic Data Commons (GDC) is an information system for storing, analyzing, and sharing genomic and clinical data from patients with cancer. The recent high-throughput sequencing of cancer genomes and transcriptomes has produced a big data problem that precludes many cancer biologists and oncologists from gleaning knowledge from these data regarding the nature of malignant processes and the relationship between tumor genomic profiles and treatment response. The GDC aims to democratize access to cancer genomic data and to foster the sharing of these data to promote precision medicine approaches to the diagnosis and treatment of cancer.","container-title":"Blood","DOI":"10.1182/blood-2017-03-735654","ISSN":"0006-4971","issue":"4","journalAbbreviation":"Blood","page":"453-459","source":"Silverchair","title":"The NCI Genomic Data Commons as an engine for precision medicine","volume":"130","author":[{"family":"Jensen","given":"Mark A."},{"family":"Ferretti","given":"Vincent"},{"family":"Grossman","given":"Robert L."},{"family":"Staudt","given":"Louis M."}],"issued":{"date-parts":[["2017",7,27]]}}}],"schema":"https://github.com/citation-style-language/schema/raw/master/csl-citation.json"} </w:instrText>
+      </w:r>
+      <w:r>
+        <w:rPr>
+          <w:rFonts w:eastAsia="Times New Roman" w:cstheme="minorHAnsi"/>
+          <w:szCs w:val="24"/>
+        </w:rPr>
+        <w:fldChar w:fldCharType="separate"/>
+      </w:r>
+      <w:r>
+        <w:rPr>
+          <w:rFonts w:ascii="Calibri" w:hAnsi="Calibri" w:cs="Calibri"/>
+          <w:szCs w:val="24"/>
+        </w:rPr>
+        <w:t>(Jensen et al. 2017)</w:t>
+      </w:r>
+      <w:r>
+        <w:rPr>
+          <w:rFonts w:eastAsia="Times New Roman" w:cstheme="minorHAnsi"/>
+          <w:szCs w:val="24"/>
+        </w:rPr>
+        <w:fldChar w:fldCharType="end"/>
+      </w:r>
+      <w:r>
+        <w:rPr>
+          <w:rFonts w:eastAsia="Times New Roman" w:cstheme="minorHAnsi"/>
+          <w:szCs w:val="24"/>
+        </w:rPr>
+        <w:t xml:space="preserve"> </w:t>
+      </w:r>
+      <w:r>
+        <w:rPr>
+          <w:rFonts w:eastAsia="Times New Roman" w:cstheme="minorHAnsi"/>
+          <w:szCs w:val="24"/>
+        </w:rPr>
+        <w:t>ha facilitado la comparabilidad entre estudios, permitiendo análisis transversales entre distintos tipos de cáncer con datos procesados bajo protocolos homogéneos. Por ello, TCGA se ha convertido en la fuente de datos predominante en numerosos estudios de modelos de supervivencia basados en genómica desde aproximadamente 2012.</w:t>
+      </w:r>
+    </w:p>
+    <w:p>
+      <w:pPr>
+        <w:spacing w:before="100" w:beforeAutospacing="1" w:after="100" w:afterAutospacing="1"/>
+      </w:pPr>
+      <w:r>
+        <w:rPr>
+          <w:rFonts w:eastAsia="Times New Roman" w:cstheme="minorHAnsi"/>
+          <w:szCs w:val="24"/>
+        </w:rPr>
+        <w:t>No obstante, TCGA presenta algunas limitaciones relevantes</w:t>
+      </w:r>
+      <w:r>
+        <w:rPr>
+          <w:rFonts w:eastAsia="Times New Roman" w:cstheme="minorHAnsi"/>
+          <w:szCs w:val="24"/>
+        </w:rPr>
+        <w:t xml:space="preserve">, como </w:t>
+      </w:r>
+      <w:r>
+        <w:rPr>
+          <w:rFonts w:eastAsia="Times New Roman" w:cstheme="minorHAnsi"/>
+          <w:szCs w:val="24"/>
+        </w:rPr>
+        <w:t xml:space="preserve">una sobrerrepresentación de pacientes de ascendencia europea (aproximadamente entre el 70 % y el 80 % según el tipo de cáncer), lo que puede limitar la capacidad de generalización de los modelos desarrollados a poblaciones más diversas. </w:t>
+      </w:r>
+    </w:p>
+    <w:p>
+      <w:pPr>
+        <w:pStyle w:val="Ttulo3"/>
+      </w:pPr>
+      <w:bookmarkStart w:id="3" w:name="_Toc224126722"/>
+      <w:r>
+        <w:t>2.</w:t>
+      </w:r>
+      <w:r>
+        <w:t>5</w:t>
+      </w:r>
+      <w:r>
+        <w:t xml:space="preserve">.2 El </w:t>
+      </w:r>
+      <w:proofErr w:type="spellStart"/>
+      <w:r>
+        <w:t>dataset</w:t>
+      </w:r>
+      <w:proofErr w:type="spellEnd"/>
+      <w:r>
+        <w:t xml:space="preserve"> METABRIC</w:t>
+      </w:r>
+      <w:bookmarkEnd w:id="3"/>
+    </w:p>
+    <w:p>
+      <w:pPr>
+        <w:spacing w:before="100" w:beforeAutospacing="1" w:after="100" w:afterAutospacing="1"/>
+        <w:jc w:val="left"/>
+        <w:rPr>
+          <w:rFonts w:ascii="Times New Roman" w:eastAsia="Times New Roman" w:hAnsi="Times New Roman" w:cs="Times New Roman"/>
+          <w:szCs w:val="24"/>
+        </w:rPr>
+      </w:pPr>
+      <w:r>
+        <w:rPr>
+          <w:rFonts w:ascii="Times New Roman" w:eastAsia="Times New Roman" w:hAnsi="Times New Roman" w:cs="Times New Roman"/>
+          <w:szCs w:val="24"/>
+        </w:rPr>
+        <w:lastRenderedPageBreak/>
+        <w:t xml:space="preserve">El conjunto de datos del </w:t>
+      </w:r>
+      <w:r>
+        <w:rPr>
+          <w:rFonts w:ascii="Times New Roman" w:eastAsia="Times New Roman" w:hAnsi="Times New Roman" w:cs="Times New Roman"/>
+          <w:b/>
+          <w:bCs/>
+          <w:szCs w:val="24"/>
+        </w:rPr>
+        <w:t xml:space="preserve">Molecular </w:t>
+      </w:r>
+      <w:proofErr w:type="spellStart"/>
+      <w:r>
+        <w:rPr>
+          <w:rFonts w:ascii="Times New Roman" w:eastAsia="Times New Roman" w:hAnsi="Times New Roman" w:cs="Times New Roman"/>
+          <w:b/>
+          <w:bCs/>
+          <w:szCs w:val="24"/>
+        </w:rPr>
+        <w:t>Taxonomy</w:t>
+      </w:r>
+      <w:proofErr w:type="spellEnd"/>
+      <w:r>
+        <w:rPr>
+          <w:rFonts w:ascii="Times New Roman" w:eastAsia="Times New Roman" w:hAnsi="Times New Roman" w:cs="Times New Roman"/>
+          <w:b/>
+          <w:bCs/>
+          <w:szCs w:val="24"/>
+        </w:rPr>
+        <w:t xml:space="preserve"> </w:t>
+      </w:r>
+      <w:proofErr w:type="spellStart"/>
+      <w:r>
+        <w:rPr>
+          <w:rFonts w:ascii="Times New Roman" w:eastAsia="Times New Roman" w:hAnsi="Times New Roman" w:cs="Times New Roman"/>
+          <w:b/>
+          <w:bCs/>
+          <w:szCs w:val="24"/>
+        </w:rPr>
+        <w:t>of</w:t>
+      </w:r>
+      <w:proofErr w:type="spellEnd"/>
+      <w:r>
+        <w:rPr>
+          <w:rFonts w:ascii="Times New Roman" w:eastAsia="Times New Roman" w:hAnsi="Times New Roman" w:cs="Times New Roman"/>
+          <w:b/>
+          <w:bCs/>
+          <w:szCs w:val="24"/>
+        </w:rPr>
+        <w:t xml:space="preserve"> </w:t>
+      </w:r>
+      <w:proofErr w:type="spellStart"/>
+      <w:r>
+        <w:rPr>
+          <w:rFonts w:ascii="Times New Roman" w:eastAsia="Times New Roman" w:hAnsi="Times New Roman" w:cs="Times New Roman"/>
+          <w:b/>
+          <w:bCs/>
+          <w:szCs w:val="24"/>
+        </w:rPr>
+        <w:t>Breast</w:t>
+      </w:r>
+      <w:proofErr w:type="spellEnd"/>
+      <w:r>
+        <w:rPr>
+          <w:rFonts w:ascii="Times New Roman" w:eastAsia="Times New Roman" w:hAnsi="Times New Roman" w:cs="Times New Roman"/>
+          <w:b/>
+          <w:bCs/>
+          <w:szCs w:val="24"/>
+        </w:rPr>
+        <w:t xml:space="preserve"> </w:t>
+      </w:r>
+      <w:proofErr w:type="spellStart"/>
+      <w:r>
+        <w:rPr>
+          <w:rFonts w:ascii="Times New Roman" w:eastAsia="Times New Roman" w:hAnsi="Times New Roman" w:cs="Times New Roman"/>
+          <w:b/>
+          <w:bCs/>
+          <w:szCs w:val="24"/>
+        </w:rPr>
+        <w:t>Cancer</w:t>
+      </w:r>
+      <w:proofErr w:type="spellEnd"/>
+      <w:r>
+        <w:rPr>
+          <w:rFonts w:ascii="Times New Roman" w:eastAsia="Times New Roman" w:hAnsi="Times New Roman" w:cs="Times New Roman"/>
+          <w:b/>
+          <w:bCs/>
+          <w:szCs w:val="24"/>
+        </w:rPr>
+        <w:t xml:space="preserve"> International </w:t>
+      </w:r>
+      <w:proofErr w:type="spellStart"/>
+      <w:r>
+        <w:rPr>
+          <w:rFonts w:ascii="Times New Roman" w:eastAsia="Times New Roman" w:hAnsi="Times New Roman" w:cs="Times New Roman"/>
+          <w:b/>
+          <w:bCs/>
+          <w:szCs w:val="24"/>
+        </w:rPr>
+        <w:t>Consortium</w:t>
+      </w:r>
+      <w:proofErr w:type="spellEnd"/>
+      <w:r>
+        <w:rPr>
+          <w:rFonts w:ascii="Times New Roman" w:eastAsia="Times New Roman" w:hAnsi="Times New Roman" w:cs="Times New Roman"/>
+          <w:b/>
+          <w:bCs/>
+          <w:szCs w:val="24"/>
+        </w:rPr>
+        <w:t xml:space="preserve"> (METABRIC)</w:t>
+      </w:r>
+      <w:r>
+        <w:rPr>
+          <w:rFonts w:ascii="Times New Roman" w:eastAsia="Times New Roman" w:hAnsi="Times New Roman" w:cs="Times New Roman"/>
+          <w:szCs w:val="24"/>
+        </w:rPr>
+        <w:t>, descrito por</w:t>
+      </w:r>
+      <w:r>
+        <w:rPr>
+          <w:rFonts w:ascii="Times New Roman" w:eastAsia="Times New Roman" w:hAnsi="Times New Roman" w:cs="Times New Roman"/>
+          <w:szCs w:val="24"/>
+        </w:rPr>
+        <w:t xml:space="preserve"> </w:t>
+      </w:r>
+      <w:r>
+        <w:rPr>
+          <w:rFonts w:ascii="Times New Roman" w:eastAsia="Times New Roman" w:hAnsi="Times New Roman" w:cs="Times New Roman"/>
+          <w:szCs w:val="24"/>
+        </w:rPr>
+        <w:fldChar w:fldCharType="begin"/>
+      </w:r>
+      <w:r>
+        <w:rPr>
+          <w:rFonts w:ascii="Times New Roman" w:eastAsia="Times New Roman" w:hAnsi="Times New Roman" w:cs="Times New Roman"/>
+          <w:szCs w:val="24"/>
+        </w:rPr>
+        <w:instrText xml:space="preserve"> ADDIN ZOTERO_ITEM CSL_CITATION {"citationID":"voEgG8Qc","properties":{"unsorted":false,"formattedCitation":"(Curtis et\\uc0\\u160{}al. 2012)","plainCitation":"(Curtis et al. 2012)","noteIndex":0},"citationItems":[{"id":192,"uris":["http://zotero.org/users/19775897/items/NLKL9VDI"],"itemData":{"id":192,"type":"article-journal","abstract":"The elucidation of breast cancer subgroups and their molecular drivers requires integrated views of the genome and transcriptome from representative numbers of patients. We present an integrated analysis of copy number and gene expression in a discovery and validation set of 997 and 995 primary breast tumours, respectively, with long-term clinical follow-up. Inherited variants (copy number variants and single nucleotide polymorphisms) and acquired somatic copy number aberrations (CNAs) were associated with expression in </w:instrText>
+      </w:r>
+      <w:r>
+        <w:rPr>
+          <w:rFonts w:ascii="Cambria Math" w:eastAsia="Times New Roman" w:hAnsi="Cambria Math" w:cs="Cambria Math"/>
+          <w:szCs w:val="24"/>
+        </w:rPr>
+        <w:instrText>∼</w:instrText>
+      </w:r>
+      <w:r>
+        <w:rPr>
+          <w:rFonts w:ascii="Times New Roman" w:eastAsia="Times New Roman" w:hAnsi="Times New Roman" w:cs="Times New Roman"/>
+          <w:szCs w:val="24"/>
+        </w:rPr>
+        <w:instrText xml:space="preserve">40% of genes, with the landscape dominated by cis- and trans-acting CNAs. By delineating expression outlier genes driven in cis by CNAs, we identified putative cancer genes, including deletions in PPP2R2A, MTAP and MAP2K4. Unsupervised analysis of paired DNA–RNA profiles revealed novel subgroups with distinct clinical outcomes, which reproduced in the validation cohort. These include a high-risk, oestrogen-receptor-positive 11q13/14 cis-acting subgroup and a favourable prognosis subgroup devoid of CNAs. Trans-acting aberration hotspots were found to modulate subgroup-specific gene networks, including a TCR deletion-mediated adaptive immune response in the ‘CNA-devoid’ subgroup and a basal-specific chromosome 5 deletion-associated mitotic network. Our results provide a novel molecular stratification of the breast cancer population, derived from the impact of somatic CNAs on the transcriptome.","container-title":"Nature","DOI":"10.1038/nature10983","ISSN":"1476-4687","issue":"7403","language":"en","license":"2012 Springer Nature Limited","page":"346-352","publisher":"Nature Publishing Group","source":"www.nature.com","title":"The genomic and transcriptomic architecture of 2,000 breast tumours reveals novel subgroups","volume":"486","author":[{"family":"Curtis","given":"Christina"},{"family":"Shah","given":"Sohrab P."},{"family":"Chin","given":"Suet-Feung"},{"family":"Turashvili","given":"Gulisa"},{"family":"Rueda","given":"Oscar M."},{"family":"Dunning","given":"Mark J."},{"family":"Speed","given":"Doug"},{"family":"Lynch","given":"Andy G."},{"family":"Samarajiwa","given":"Shamith"},{"family":"Yuan","given":"Yinyin"},{"family":"Gräf","given":"Stefan"},{"family":"Ha","given":"Gavin"},{"family":"Haffari","given":"Gholamreza"},{"family":"Bashashati","given":"Ali"},{"family":"Russell","given":"Roslin"},{"family":"McKinney","given":"Steven"},{"family":"Langerød","given":"Anita"},{"family":"Green","given":"Andrew"},{"family":"Provenzano","given":"Elena"},{"family":"Wishart","given":"Gordon"},{"family":"Pinder","given":"Sarah"},{"family":"Watson","given":"Peter"},{"family":"Markowetz","given":"Florian"},{"literal":"Leigh Murphy"},{"family":"Ellis","given":"Ian"},{"family":"Purushotham","given":"Arnie"},{"family":"Børresen-Dale","given":"Anne-Lise"},{"family":"Brenton","given":"James D."},{"family":"Tavaré","given":"Simon"},{"family":"Caldas","given":"Carlos"},{"family":"Aparicio","given":"Samuel"}],"issued":{"date-parts":[["2012",6]]}}}],"schema":"https://github.com/citation-style-language/schema/raw/master/csl-citation.json"} </w:instrText>
+      </w:r>
+      <w:r>
+        <w:rPr>
+          <w:rFonts w:ascii="Times New Roman" w:eastAsia="Times New Roman" w:hAnsi="Times New Roman" w:cs="Times New Roman"/>
+          <w:szCs w:val="24"/>
+        </w:rPr>
+        <w:fldChar w:fldCharType="separate"/>
+      </w:r>
+      <w:r>
+        <w:rPr>
+          <w:rFonts w:ascii="Calibri" w:hAnsi="Calibri" w:cs="Calibri"/>
+          <w:szCs w:val="24"/>
+        </w:rPr>
+        <w:t xml:space="preserve">Curtis et al. </w:t>
+      </w:r>
+      <w:r>
+        <w:rPr>
+          <w:rFonts w:ascii="Calibri" w:hAnsi="Calibri" w:cs="Calibri"/>
+          <w:szCs w:val="24"/>
+        </w:rPr>
+        <w:t xml:space="preserve">en </w:t>
+      </w:r>
+      <w:r>
+        <w:rPr>
+          <w:rFonts w:ascii="Calibri" w:hAnsi="Calibri" w:cs="Calibri"/>
+          <w:szCs w:val="24"/>
+        </w:rPr>
+        <w:t>2012</w:t>
+      </w:r>
+      <w:r>
+        <w:rPr>
+          <w:rFonts w:ascii="Times New Roman" w:eastAsia="Times New Roman" w:hAnsi="Times New Roman" w:cs="Times New Roman"/>
+          <w:szCs w:val="24"/>
+        </w:rPr>
+        <w:fldChar w:fldCharType="end"/>
+      </w:r>
+      <w:r>
+        <w:rPr>
+          <w:rFonts w:ascii="Times New Roman" w:eastAsia="Times New Roman" w:hAnsi="Times New Roman" w:cs="Times New Roman"/>
+          <w:szCs w:val="24"/>
+        </w:rPr>
+        <w:t xml:space="preserve">, constituye uno de los recursos más completos para el estudio genómico del cáncer de mama. Este </w:t>
+      </w:r>
+      <w:proofErr w:type="spellStart"/>
+      <w:r>
+        <w:rPr>
+          <w:rFonts w:ascii="Times New Roman" w:eastAsia="Times New Roman" w:hAnsi="Times New Roman" w:cs="Times New Roman"/>
+          <w:szCs w:val="24"/>
+        </w:rPr>
+        <w:t>dataset</w:t>
+      </w:r>
+      <w:proofErr w:type="spellEnd"/>
+      <w:r>
+        <w:rPr>
+          <w:rFonts w:ascii="Times New Roman" w:eastAsia="Times New Roman" w:hAnsi="Times New Roman" w:cs="Times New Roman"/>
+          <w:szCs w:val="24"/>
+        </w:rPr>
+        <w:t xml:space="preserve"> incluye perfiles de </w:t>
+      </w:r>
+      <w:r>
+        <w:rPr>
+          <w:rFonts w:ascii="Times New Roman" w:eastAsia="Times New Roman" w:hAnsi="Times New Roman" w:cs="Times New Roman"/>
+          <w:b/>
+          <w:bCs/>
+          <w:szCs w:val="24"/>
+        </w:rPr>
+        <w:t xml:space="preserve">expresión génica por </w:t>
+      </w:r>
+      <w:proofErr w:type="spellStart"/>
+      <w:r>
+        <w:rPr>
+          <w:rFonts w:ascii="Times New Roman" w:eastAsia="Times New Roman" w:hAnsi="Times New Roman" w:cs="Times New Roman"/>
+          <w:b/>
+          <w:bCs/>
+          <w:szCs w:val="24"/>
+        </w:rPr>
+        <w:t>microarrays</w:t>
+      </w:r>
+      <w:proofErr w:type="spellEnd"/>
+      <w:r>
+        <w:rPr>
+          <w:rFonts w:ascii="Times New Roman" w:eastAsia="Times New Roman" w:hAnsi="Times New Roman" w:cs="Times New Roman"/>
+          <w:b/>
+          <w:bCs/>
+          <w:szCs w:val="24"/>
+        </w:rPr>
+        <w:t>, variaciones en número de copias y datos clínicos detallados</w:t>
+      </w:r>
+      <w:r>
+        <w:rPr>
+          <w:rFonts w:ascii="Times New Roman" w:eastAsia="Times New Roman" w:hAnsi="Times New Roman" w:cs="Times New Roman"/>
+          <w:szCs w:val="24"/>
+        </w:rPr>
+        <w:t xml:space="preserve"> de aproximadamente </w:t>
+      </w:r>
+      <w:r>
+        <w:rPr>
+          <w:rFonts w:ascii="Times New Roman" w:eastAsia="Times New Roman" w:hAnsi="Times New Roman" w:cs="Times New Roman"/>
+          <w:b/>
+          <w:bCs/>
+          <w:szCs w:val="24"/>
+        </w:rPr>
+        <w:t>1.980 pacientes con cáncer de mam</w:t>
+      </w:r>
+      <w:r>
+        <w:rPr>
+          <w:rFonts w:ascii="Times New Roman" w:eastAsia="Times New Roman" w:hAnsi="Times New Roman" w:cs="Times New Roman"/>
+          <w:b/>
+          <w:bCs/>
+          <w:szCs w:val="24"/>
+        </w:rPr>
+        <w:t>a</w:t>
+      </w:r>
+      <w:r>
+        <w:rPr>
+          <w:rFonts w:ascii="Times New Roman" w:eastAsia="Times New Roman" w:hAnsi="Times New Roman" w:cs="Times New Roman"/>
+          <w:szCs w:val="24"/>
+        </w:rPr>
+        <w:t xml:space="preserve">, con información de seguimiento clínico prolongado. Mediante un análisis integrador de expresión génica y alteraciones en número de copias, el estudio identificó </w:t>
+      </w:r>
+      <w:r>
+        <w:rPr>
+          <w:rFonts w:ascii="Times New Roman" w:eastAsia="Times New Roman" w:hAnsi="Times New Roman" w:cs="Times New Roman"/>
+          <w:b/>
+          <w:bCs/>
+          <w:szCs w:val="24"/>
+        </w:rPr>
+        <w:t>diez subgrupos moleculares (IntClust1</w:t>
+      </w:r>
+      <w:r>
+        <w:rPr>
+          <w:rFonts w:ascii="Times New Roman" w:eastAsia="Times New Roman" w:hAnsi="Times New Roman" w:cs="Times New Roman"/>
+          <w:b/>
+          <w:bCs/>
+          <w:szCs w:val="24"/>
+        </w:rPr>
+        <w:t>-</w:t>
+      </w:r>
+      <w:r>
+        <w:rPr>
+          <w:rFonts w:ascii="Times New Roman" w:eastAsia="Times New Roman" w:hAnsi="Times New Roman" w:cs="Times New Roman"/>
+          <w:b/>
+          <w:bCs/>
+          <w:szCs w:val="24"/>
+        </w:rPr>
+        <w:t>10)</w:t>
+      </w:r>
+      <w:r>
+        <w:rPr>
+          <w:rFonts w:ascii="Times New Roman" w:eastAsia="Times New Roman" w:hAnsi="Times New Roman" w:cs="Times New Roman"/>
+          <w:szCs w:val="24"/>
+        </w:rPr>
+        <w:t xml:space="preserve"> con perfiles pronósticos diferenciados, algunos de los cuales no se corresponden directamente con la clasificación clínica tradicional ni con los subtipos intrínsecos previamente descritos por</w:t>
+      </w:r>
+      <w:r>
+        <w:rPr>
+          <w:rFonts w:ascii="Times New Roman" w:eastAsia="Times New Roman" w:hAnsi="Times New Roman" w:cs="Times New Roman"/>
+          <w:szCs w:val="24"/>
+        </w:rPr>
+        <w:t xml:space="preserve"> </w:t>
+      </w:r>
+      <w:r>
+        <w:rPr>
+          <w:rFonts w:ascii="Times New Roman" w:eastAsia="Times New Roman" w:hAnsi="Times New Roman" w:cs="Times New Roman"/>
+          <w:szCs w:val="24"/>
+        </w:rPr>
+        <w:fldChar w:fldCharType="begin"/>
+      </w:r>
+      <w:r>
+        <w:rPr>
+          <w:rFonts w:ascii="Times New Roman" w:eastAsia="Times New Roman" w:hAnsi="Times New Roman" w:cs="Times New Roman"/>
+          <w:szCs w:val="24"/>
+        </w:rPr>
+        <w:instrText xml:space="preserve"> ADDIN ZOTERO_ITEM CSL_CITATION {"citationID":"alVBT2hC","properties":{"unsorted":false,"formattedCitation":"(Perou et\\uc0\\u160{}al. 2000)","plainCitation":"(Perou et al. 2000)","noteIndex":0},"citationItems":[{"id":194,"uris":["http://zotero.org/users/19775897/items/KTD796Z9"],"itemData":{"id":194,"type":"article-journal","abstract":"Human breast tumours are diverse in their natural history and in their responsiveness to treatments1. Variation in transcriptional programs accounts for much of the biological diversity of human cells and tumours. In each cell, signal transduction and regulatory systems transduce information from the cell's identity to its environmental status, thereby controlling the level of expression of every gene in the genome. Here we have characterized variation in gene expression patterns in a set of 65 surgical specimens of human breast tumours from 42 different individuals, using complementary DNA microarrays representing 8,102 human genes. These patterns provided a distinctive molecular portrait of each tumour. Twenty of the tumours were sampled twice, before and after a 16-week course of doxorubicin chemotherapy, and two tumours were paired with a lymph node metastasis from the same patient. Gene expression patterns in two tumour samples from the same individual were almost always more similar to each other than either was to any other sample. Sets of co-expressed genes were identified for which variation in messenger RNA levels could be related to specific features of physiological variation. The tumours could be classified into subtypes distinguished by pervasive differences in their gene expression patterns.","container-title":"Nature","DOI":"10.1038/35021093","ISSN":"1476-4687","issue":"6797","language":"en","license":"2000 Macmillan Magazines Ltd.","page":"747-752","publisher":"Nature Publishing Group","source":"www.nature.com","title":"Molecular portraits of human breast tumours","volume":"406","author":[{"family":"Perou","given":"Charles M."},{"family":"Sørlie","given":"Therese"},{"family":"Eisen","given":"Michael B."},{"family":"Rijn","given":"Matt","non-dropping-particle":"van de"},{"family":"Jeffrey","given":"Stefanie S."},{"family":"Rees","given":"Christian A."},{"family":"Pollack","given":"Jonathan R."},{"family":"Ross","given":"Douglas T."},{"family":"Johnsen","given":"Hilde"},{"family":"Akslen","given":"Lars A."},{"family":"Fluge","given":"Øystein"},{"family":"Pergamenschikov","given":"Alexander"},{"family":"Williams","given":"Cheryl"},{"family":"Zhu","given":"Shirley X."},{"family":"Lønning","given":"Per E."},{"family":"Børresen-Dale","given":"Anne-Lise"},{"family":"Brown","given":"Patrick O."},{"family":"Botstein","given":"David"}],"issued":{"date-parts":[["2000",8]]}}}],"schema":"https://github.com/citation-style-language/schema/raw/master/csl-citation.json"} </w:instrText>
+      </w:r>
+      <w:r>
+        <w:rPr>
+          <w:rFonts w:ascii="Times New Roman" w:eastAsia="Times New Roman" w:hAnsi="Times New Roman" w:cs="Times New Roman"/>
+          <w:szCs w:val="24"/>
+        </w:rPr>
+        <w:fldChar w:fldCharType="separate"/>
+      </w:r>
+      <w:proofErr w:type="spellStart"/>
+      <w:r>
+        <w:rPr>
+          <w:rFonts w:ascii="Calibri" w:hAnsi="Calibri" w:cs="Calibri"/>
+          <w:szCs w:val="24"/>
+        </w:rPr>
+        <w:t>Perou</w:t>
+      </w:r>
+      <w:proofErr w:type="spellEnd"/>
+      <w:r>
+        <w:rPr>
+          <w:rFonts w:ascii="Calibri" w:hAnsi="Calibri" w:cs="Calibri"/>
+          <w:szCs w:val="24"/>
+        </w:rPr>
+        <w:t xml:space="preserve"> et al. </w:t>
+      </w:r>
+      <w:r>
+        <w:rPr>
+          <w:rFonts w:ascii="Calibri" w:hAnsi="Calibri" w:cs="Calibri"/>
+          <w:szCs w:val="24"/>
+        </w:rPr>
+        <w:t>(</w:t>
+      </w:r>
+      <w:r>
+        <w:rPr>
+          <w:rFonts w:ascii="Calibri" w:hAnsi="Calibri" w:cs="Calibri"/>
+          <w:szCs w:val="24"/>
+        </w:rPr>
+        <w:t>2000)</w:t>
+      </w:r>
+      <w:r>
+        <w:rPr>
+          <w:rFonts w:ascii="Times New Roman" w:eastAsia="Times New Roman" w:hAnsi="Times New Roman" w:cs="Times New Roman"/>
+          <w:szCs w:val="24"/>
+        </w:rPr>
+        <w:fldChar w:fldCharType="end"/>
+      </w:r>
+      <w:r>
+        <w:rPr>
+          <w:rFonts w:ascii="Times New Roman" w:eastAsia="Times New Roman" w:hAnsi="Times New Roman" w:cs="Times New Roman"/>
+          <w:szCs w:val="24"/>
+        </w:rPr>
+        <w:t xml:space="preserve">. </w:t>
+      </w:r>
+    </w:p>
+    <w:p>
+      <w:pPr>
+        <w:spacing w:before="100" w:beforeAutospacing="1" w:after="100" w:afterAutospacing="1"/>
+        <w:jc w:val="left"/>
+        <w:rPr>
+          <w:rFonts w:ascii="Times New Roman" w:eastAsia="Times New Roman" w:hAnsi="Times New Roman" w:cs="Times New Roman"/>
+          <w:szCs w:val="24"/>
+        </w:rPr>
+      </w:pPr>
+      <w:r>
+        <w:rPr>
+          <w:rFonts w:ascii="Times New Roman" w:eastAsia="Times New Roman" w:hAnsi="Times New Roman" w:cs="Times New Roman"/>
+          <w:szCs w:val="24"/>
+        </w:rPr>
+        <w:t xml:space="preserve">La amplia disponibilidad de METABRIC a través de plataformas como </w:t>
+      </w:r>
+      <w:proofErr w:type="spellStart"/>
+      <w:r>
+        <w:rPr>
+          <w:rFonts w:ascii="Times New Roman" w:eastAsia="Times New Roman" w:hAnsi="Times New Roman" w:cs="Times New Roman"/>
+          <w:szCs w:val="24"/>
+        </w:rPr>
+        <w:t>cBioPortal</w:t>
+      </w:r>
+      <w:proofErr w:type="spellEnd"/>
+      <w:r>
+        <w:rPr>
+          <w:rFonts w:ascii="Times New Roman" w:eastAsia="Times New Roman" w:hAnsi="Times New Roman" w:cs="Times New Roman"/>
+          <w:szCs w:val="24"/>
+        </w:rPr>
+        <w:t xml:space="preserve"> y el </w:t>
+      </w:r>
+      <w:proofErr w:type="spellStart"/>
+      <w:r>
+        <w:rPr>
+          <w:rFonts w:ascii="Times New Roman" w:eastAsia="Times New Roman" w:hAnsi="Times New Roman" w:cs="Times New Roman"/>
+          <w:szCs w:val="24"/>
+        </w:rPr>
+        <w:t>European</w:t>
+      </w:r>
+      <w:proofErr w:type="spellEnd"/>
+      <w:r>
+        <w:rPr>
+          <w:rFonts w:ascii="Times New Roman" w:eastAsia="Times New Roman" w:hAnsi="Times New Roman" w:cs="Times New Roman"/>
+          <w:szCs w:val="24"/>
+        </w:rPr>
+        <w:t xml:space="preserve"> </w:t>
+      </w:r>
+      <w:proofErr w:type="spellStart"/>
+      <w:r>
+        <w:rPr>
+          <w:rFonts w:ascii="Times New Roman" w:eastAsia="Times New Roman" w:hAnsi="Times New Roman" w:cs="Times New Roman"/>
+          <w:szCs w:val="24"/>
+        </w:rPr>
+        <w:t>Genome-phenome</w:t>
+      </w:r>
+      <w:proofErr w:type="spellEnd"/>
+      <w:r>
+        <w:rPr>
+          <w:rFonts w:ascii="Times New Roman" w:eastAsia="Times New Roman" w:hAnsi="Times New Roman" w:cs="Times New Roman"/>
+          <w:szCs w:val="24"/>
+        </w:rPr>
+        <w:t xml:space="preserve"> Archive ha favorecido su utilización como </w:t>
+      </w:r>
+      <w:r>
+        <w:rPr>
+          <w:rFonts w:ascii="Times New Roman" w:eastAsia="Times New Roman" w:hAnsi="Times New Roman" w:cs="Times New Roman"/>
+          <w:b/>
+          <w:bCs/>
+          <w:szCs w:val="24"/>
+        </w:rPr>
+        <w:t>cohorte independiente de validación en estudios genómicos</w:t>
+      </w:r>
+      <w:r>
+        <w:rPr>
+          <w:rFonts w:ascii="Times New Roman" w:eastAsia="Times New Roman" w:hAnsi="Times New Roman" w:cs="Times New Roman"/>
+          <w:szCs w:val="24"/>
+        </w:rPr>
+        <w:t xml:space="preserve">, especialmente para evaluar modelos entrenados en datos del proyecto </w:t>
+      </w:r>
+      <w:proofErr w:type="spellStart"/>
+      <w:r>
+        <w:rPr>
+          <w:rFonts w:ascii="Times New Roman" w:eastAsia="Times New Roman" w:hAnsi="Times New Roman" w:cs="Times New Roman"/>
+          <w:szCs w:val="24"/>
+        </w:rPr>
+        <w:t>The</w:t>
+      </w:r>
+      <w:proofErr w:type="spellEnd"/>
+      <w:r>
+        <w:rPr>
+          <w:rFonts w:ascii="Times New Roman" w:eastAsia="Times New Roman" w:hAnsi="Times New Roman" w:cs="Times New Roman"/>
+          <w:szCs w:val="24"/>
+        </w:rPr>
+        <w:t xml:space="preserve"> </w:t>
+      </w:r>
+      <w:proofErr w:type="spellStart"/>
+      <w:r>
+        <w:rPr>
+          <w:rFonts w:ascii="Times New Roman" w:eastAsia="Times New Roman" w:hAnsi="Times New Roman" w:cs="Times New Roman"/>
+          <w:szCs w:val="24"/>
+        </w:rPr>
+        <w:t>Cancer</w:t>
+      </w:r>
+      <w:proofErr w:type="spellEnd"/>
+      <w:r>
+        <w:rPr>
+          <w:rFonts w:ascii="Times New Roman" w:eastAsia="Times New Roman" w:hAnsi="Times New Roman" w:cs="Times New Roman"/>
+          <w:szCs w:val="24"/>
+        </w:rPr>
+        <w:t xml:space="preserve"> </w:t>
+      </w:r>
+      <w:proofErr w:type="spellStart"/>
+      <w:r>
+        <w:rPr>
+          <w:rFonts w:ascii="Times New Roman" w:eastAsia="Times New Roman" w:hAnsi="Times New Roman" w:cs="Times New Roman"/>
+          <w:szCs w:val="24"/>
+        </w:rPr>
+        <w:t>Genome</w:t>
+      </w:r>
+      <w:proofErr w:type="spellEnd"/>
+      <w:r>
+        <w:rPr>
+          <w:rFonts w:ascii="Times New Roman" w:eastAsia="Times New Roman" w:hAnsi="Times New Roman" w:cs="Times New Roman"/>
+          <w:szCs w:val="24"/>
+        </w:rPr>
+        <w:t xml:space="preserve"> Atlas. No obstante, existen diferencias técnicas importantes entre ambos recursos </w:t>
+      </w:r>
+      <w:r>
+        <w:rPr>
+          <w:rFonts w:ascii="Times New Roman" w:eastAsia="Times New Roman" w:hAnsi="Times New Roman" w:cs="Times New Roman"/>
+          <w:szCs w:val="24"/>
+        </w:rPr>
+        <w:t>(</w:t>
+      </w:r>
+      <w:r>
+        <w:rPr>
+          <w:rFonts w:ascii="Times New Roman" w:eastAsia="Times New Roman" w:hAnsi="Times New Roman" w:cs="Times New Roman"/>
+          <w:szCs w:val="24"/>
+        </w:rPr>
+        <w:t xml:space="preserve">principalmente el uso de </w:t>
+      </w:r>
+      <w:proofErr w:type="spellStart"/>
+      <w:r>
+        <w:rPr>
+          <w:rFonts w:ascii="Times New Roman" w:eastAsia="Times New Roman" w:hAnsi="Times New Roman" w:cs="Times New Roman"/>
+          <w:b/>
+          <w:bCs/>
+          <w:szCs w:val="24"/>
+        </w:rPr>
+        <w:t>microarrays</w:t>
+      </w:r>
+      <w:proofErr w:type="spellEnd"/>
+      <w:r>
+        <w:rPr>
+          <w:rFonts w:ascii="Times New Roman" w:eastAsia="Times New Roman" w:hAnsi="Times New Roman" w:cs="Times New Roman"/>
+          <w:b/>
+          <w:bCs/>
+          <w:szCs w:val="24"/>
+        </w:rPr>
+        <w:t xml:space="preserve"> en METABRIC frente a RNA-</w:t>
+      </w:r>
+      <w:proofErr w:type="spellStart"/>
+      <w:r>
+        <w:rPr>
+          <w:rFonts w:ascii="Times New Roman" w:eastAsia="Times New Roman" w:hAnsi="Times New Roman" w:cs="Times New Roman"/>
+          <w:b/>
+          <w:bCs/>
+          <w:szCs w:val="24"/>
+        </w:rPr>
+        <w:t>seq</w:t>
+      </w:r>
+      <w:proofErr w:type="spellEnd"/>
+      <w:r>
+        <w:rPr>
+          <w:rFonts w:ascii="Times New Roman" w:eastAsia="Times New Roman" w:hAnsi="Times New Roman" w:cs="Times New Roman"/>
+          <w:b/>
+          <w:bCs/>
+          <w:szCs w:val="24"/>
+        </w:rPr>
+        <w:t xml:space="preserve"> en TCGA</w:t>
+      </w:r>
+      <w:r>
+        <w:rPr>
+          <w:rFonts w:ascii="Times New Roman" w:eastAsia="Times New Roman" w:hAnsi="Times New Roman" w:cs="Times New Roman"/>
+          <w:szCs w:val="24"/>
+        </w:rPr>
+        <w:t>)</w:t>
+      </w:r>
+      <w:r>
+        <w:rPr>
+          <w:rFonts w:ascii="Times New Roman" w:eastAsia="Times New Roman" w:hAnsi="Times New Roman" w:cs="Times New Roman"/>
+          <w:szCs w:val="24"/>
+        </w:rPr>
+        <w:t xml:space="preserve"> que pueden generar discrepancias sistemáticas en los niveles de expresión génica, por lo que es habitual aplicar técnicas de </w:t>
+      </w:r>
+      <w:r>
+        <w:rPr>
+          <w:rFonts w:ascii="Times New Roman" w:eastAsia="Times New Roman" w:hAnsi="Times New Roman" w:cs="Times New Roman"/>
+          <w:b/>
+          <w:bCs/>
+          <w:szCs w:val="24"/>
+        </w:rPr>
+        <w:t>normalización cruzada o corrección de efectos de lote</w:t>
+      </w:r>
+      <w:r>
+        <w:rPr>
+          <w:rFonts w:ascii="Times New Roman" w:eastAsia="Times New Roman" w:hAnsi="Times New Roman" w:cs="Times New Roman"/>
+          <w:szCs w:val="24"/>
+        </w:rPr>
+        <w:t xml:space="preserve"> para garantizar la comparabilidad entre </w:t>
+      </w:r>
+      <w:proofErr w:type="spellStart"/>
+      <w:r>
+        <w:rPr>
+          <w:rFonts w:ascii="Times New Roman" w:eastAsia="Times New Roman" w:hAnsi="Times New Roman" w:cs="Times New Roman"/>
+          <w:szCs w:val="24"/>
+        </w:rPr>
+        <w:t>datasets</w:t>
+      </w:r>
+      <w:proofErr w:type="spellEnd"/>
+      <w:r>
+        <w:rPr>
+          <w:rFonts w:ascii="Times New Roman" w:eastAsia="Times New Roman" w:hAnsi="Times New Roman" w:cs="Times New Roman"/>
+          <w:szCs w:val="24"/>
+        </w:rPr>
+        <w:t xml:space="preserve"> </w:t>
+      </w:r>
+      <w:r>
+        <w:rPr>
+          <w:rFonts w:ascii="Times New Roman" w:eastAsia="Times New Roman" w:hAnsi="Times New Roman" w:cs="Times New Roman"/>
+          <w:szCs w:val="24"/>
+        </w:rPr>
+        <w:fldChar w:fldCharType="begin"/>
+      </w:r>
+      <w:r>
+        <w:rPr>
+          <w:rFonts w:ascii="Times New Roman" w:eastAsia="Times New Roman" w:hAnsi="Times New Roman" w:cs="Times New Roman"/>
+          <w:szCs w:val="24"/>
+        </w:rPr>
+        <w:instrText xml:space="preserve"> ADDIN ZOTERO_ITEM CSL_CITATION {"citationID":"AnBnBKaQ","properties":{"unsorted":false,"formattedCitation":"(Leek et\\uc0\\u160{}al. 2012)","plainCitation":"(Leek et al. 2012)","noteIndex":0},"citationItems":[{"id":115,"uris":["http://zotero.org/users/19775897/items/ZVCJUBFK"],"itemData":{"id":115,"type":"article-journal","abstract":"Summary: Heterogeneity and latent variables are now widely recognized as major sources of bias and variability in high-throughput experiments. The most well-known source of latent variation in genomic experiments are batch effects—when samples are processed on different days, in different groups or by different people. However, there are also a large number of other variables that may have a major impact on high-throughput measurements. Here we describe the sva package for identifying, estimating and removing unwanted sources of variation in high-throughput experiments. The sva package supports surrogate variable estimation with the sva function, direct adjustment for known batch effects with the ComBat function and adjustment for batch and latent variables in prediction problems with the fsva function.Availability: The R package sva is freely available from http://www.bioconductor.org.Contact:  jleek@jhsph.eduSupplementary information:  Supplementary data are available at Bioinformatics online.","container-title":"Bioinformatics","DOI":"10.1093/bioinformatics/bts034","ISSN":"1367-4803","issue":"6","journalAbbreviation":"Bioinformatics","page":"882-883","source":"Silverchair","title":"The sva package for removing batch effects and other unwanted variation in high-throughput experiments","volume":"28","author":[{"family":"Leek","given":"Jeffrey T."},{"family":"Johnson","given":"W. Evan"},{"family":"Parker","given":"Hilary S."},{"family":"Jaffe","given":"Andrew E."},{"family":"Storey","given":"John D."}],"issued":{"date-parts":[["2012",3,15]]}}}],"schema":"https://github.com/citation-style-language/schema/raw/master/csl-citation.json"} </w:instrText>
+      </w:r>
+      <w:r>
+        <w:rPr>
+          <w:rFonts w:ascii="Times New Roman" w:eastAsia="Times New Roman" w:hAnsi="Times New Roman" w:cs="Times New Roman"/>
+          <w:szCs w:val="24"/>
+        </w:rPr>
+        <w:fldChar w:fldCharType="separate"/>
+      </w:r>
+      <w:r>
+        <w:rPr>
+          <w:rFonts w:ascii="Calibri" w:hAnsi="Calibri" w:cs="Calibri"/>
+          <w:szCs w:val="24"/>
+        </w:rPr>
+        <w:t>(</w:t>
+      </w:r>
+      <w:proofErr w:type="spellStart"/>
+      <w:r>
+        <w:rPr>
+          <w:rFonts w:ascii="Calibri" w:hAnsi="Calibri" w:cs="Calibri"/>
+          <w:szCs w:val="24"/>
+        </w:rPr>
+        <w:t>Leek</w:t>
+      </w:r>
+      <w:proofErr w:type="spellEnd"/>
+      <w:r>
+        <w:rPr>
+          <w:rFonts w:ascii="Calibri" w:hAnsi="Calibri" w:cs="Calibri"/>
+          <w:szCs w:val="24"/>
+        </w:rPr>
+        <w:t xml:space="preserve"> et al. 2012)</w:t>
+      </w:r>
+      <w:r>
+        <w:rPr>
+          <w:rFonts w:ascii="Times New Roman" w:eastAsia="Times New Roman" w:hAnsi="Times New Roman" w:cs="Times New Roman"/>
+          <w:szCs w:val="24"/>
+        </w:rPr>
+        <w:fldChar w:fldCharType="end"/>
+      </w:r>
+      <w:r>
+        <w:rPr>
+          <w:rFonts w:ascii="Times New Roman" w:eastAsia="Times New Roman" w:hAnsi="Times New Roman" w:cs="Times New Roman"/>
+          <w:szCs w:val="24"/>
+        </w:rPr>
+        <w:t>.</w:t>
+      </w:r>
+    </w:p>
+    <w:p>
+      <w:pPr>
+        <w:pStyle w:val="Ttulo3"/>
+      </w:pPr>
+      <w:bookmarkStart w:id="4" w:name="_Toc223802781"/>
+      <w:r>
+        <w:t>2.5.3 Tipos de datos genómicos y su contribución pronóstica</w:t>
+      </w:r>
+      <w:bookmarkEnd w:id="4"/>
+    </w:p>
+    <w:p>
+      <w:pPr>
+        <w:pStyle w:val="NormalWeb"/>
+      </w:pPr>
+      <w:r>
+        <w:t xml:space="preserve">La contribución relativa de cada tipo de dato genómico a la capacidad predictiva de los modelos de supervivencia ha sido analizada en varios estudios comparativos. </w:t>
+      </w:r>
+      <w:r>
+        <w:fldChar w:fldCharType="begin"/>
+      </w:r>
+      <w:r>
+        <w:instrText xml:space="preserve"> ADDIN ZOTERO_ITEM CSL_CITATION {"citationID":"cApC1bpM","properties":{"unsorted":false,"formattedCitation":"(Tong et\\uc0\\u160{}al. 2020)","plainCitation":"(Tong et al. 2020)","noteIndex":0},"citationItems":[{"id":102,"uris":["http://zotero.org/users/19775897/items/Z82U38ET"],"itemData":{"id":102,"type":"article-journal","abstract":"Breast cancer is the most prevalent and among the most deadly cancers in females. Patients with breast cancer have highly variable survival lengths, indicating a need to identify prognostic biomarkers for personalized diagnosis and treatment. With the development of new technologies such as next-generation sequencing, multi-omics information are becoming available for a more thorough evaluation of a patient’s condition. In this study, we aim to improve breast cancer overall survival prediction by integrating multi-omics data (e.g., gene expression, DNA methylation, miRNA expression, and copy number variations (CNVs)).","container-title":"BMC Medical Informatics and Decision Making","DOI":"10.1186/s12911-020-01225-8","ISSN":"1472-6947","issue":"1","journalAbbreviation":"BMC Med Inform Decis Mak","language":"en","page":"225","source":"Springer Link","title":"Deep learning based feature-level integration of multi-omics data for breast cancer patients survival analysis","volume":"20","author":[{"family":"Tong","given":"Li"},{"family":"Mitchel","given":"Jonathan"},{"family":"Chatlin","given":"Kevin"},{"family":"Wang","given":"May D."}],"issued":{"date-parts":[["2020",9,15]]}}}],"schema":"https://github.com/citation-style-language/schema/raw/master/csl-citation.json"} </w:instrText>
+      </w:r>
+      <w:r>
+        <w:fldChar w:fldCharType="separate"/>
+      </w:r>
+      <w:proofErr w:type="spellStart"/>
+      <w:r>
+        <w:rPr>
+          <w:rFonts w:ascii="Calibri" w:hAnsi="Calibri" w:cs="Calibri"/>
+        </w:rPr>
+        <w:t>Tong</w:t>
+      </w:r>
+      <w:proofErr w:type="spellEnd"/>
+      <w:r>
+        <w:rPr>
+          <w:rFonts w:ascii="Calibri" w:hAnsi="Calibri" w:cs="Calibri"/>
+        </w:rPr>
+        <w:t xml:space="preserve"> et al. </w:t>
+      </w:r>
+      <w:r>
+        <w:rPr>
+          <w:rFonts w:ascii="Calibri" w:hAnsi="Calibri" w:cs="Calibri"/>
+        </w:rPr>
+        <w:t>(</w:t>
+      </w:r>
+      <w:r>
+        <w:rPr>
+          <w:rFonts w:ascii="Calibri" w:hAnsi="Calibri" w:cs="Calibri"/>
+        </w:rPr>
+        <w:t>2020)</w:t>
+      </w:r>
+      <w:proofErr w:type="spellStart"/>
+      <w:r>
+        <w:fldChar w:fldCharType="end"/>
+      </w:r>
+      <w:proofErr w:type="spellEnd"/>
+      <w:r>
+        <w:t xml:space="preserve"> encontraron que la expresión génica (</w:t>
+      </w:r>
+      <w:proofErr w:type="spellStart"/>
+      <w:r>
+        <w:t>m</w:t>
+      </w:r>
+      <w:r>
+        <w:t>i</w:t>
+      </w:r>
+      <w:r>
+        <w:t>RNA</w:t>
+      </w:r>
+      <w:proofErr w:type="spellEnd"/>
+      <w:r>
+        <w:t xml:space="preserve">) era consistentemente la modalidad más informativa </w:t>
+      </w:r>
+      <w:r>
+        <w:t>e</w:t>
+      </w:r>
+      <w:r>
+        <w:t xml:space="preserve">ntre las modalidades </w:t>
+      </w:r>
+      <w:r>
+        <w:t>individuales, mientras</w:t>
+      </w:r>
+      <w:r>
+        <w:t xml:space="preserve"> que las </w:t>
+      </w:r>
+      <w:proofErr w:type="spellStart"/>
+      <w:r>
+        <w:t>CNVs</w:t>
+      </w:r>
+      <w:proofErr w:type="spellEnd"/>
+      <w:r>
+        <w:t xml:space="preserve"> fueron las menos útiles para la supervivencia global.</w:t>
+      </w:r>
+      <w:r>
+        <w:t xml:space="preserve"> </w:t>
+      </w:r>
+      <w:r>
+        <w:t>Así</w:t>
+      </w:r>
+      <w:r>
+        <w:t xml:space="preserve"> mismo, la combinación de metilación del ADN y expresión de </w:t>
+      </w:r>
+      <w:proofErr w:type="spellStart"/>
+      <w:r>
+        <w:t>miRNA</w:t>
+      </w:r>
+      <w:proofErr w:type="spellEnd"/>
+      <w:r>
+        <w:t xml:space="preserve"> utilizando PCA y el modelo </w:t>
+      </w:r>
+      <w:proofErr w:type="spellStart"/>
+      <w:r>
+        <w:t>ConcatAE</w:t>
+      </w:r>
+      <w:proofErr w:type="spellEnd"/>
+      <w:r>
+        <w:t xml:space="preserve"> logró superar a modelos de una sola modalidad</w:t>
+      </w:r>
+      <w:r>
+        <w:t xml:space="preserve"> en términos del C-</w:t>
+      </w:r>
+      <w:proofErr w:type="spellStart"/>
+      <w:r>
+        <w:t>index</w:t>
+      </w:r>
+      <w:proofErr w:type="spellEnd"/>
+      <w:r>
+        <w:t>.</w:t>
+      </w:r>
+    </w:p>
+    <w:p>
+      <w:pPr>
         <w:spacing w:after="160"/>
-        <w:rPr>
-          <w:rFonts w:ascii="Arial" w:hAnsi="Arial"/>
-          <w:sz w:val="22"/>
-        </w:rPr>
       </w:pPr>
       <w:r>
-        <w:t xml:space="preserve">El proyecto </w:t>
-      </w:r>
-      <w:proofErr w:type="spellStart"/>
-      <w:r>
-        <w:t>The</w:t>
-      </w:r>
-      <w:proofErr w:type="spellEnd"/>
+        <w:t>Por otro lado, l</w:t>
+      </w:r>
+      <w:r>
+        <w:t xml:space="preserve">as mutaciones somáticas presentan una contribución pronóstica más heterogénea: mientras que en cáncer de pulmón las mutaciones </w:t>
+      </w:r>
+      <w:r>
+        <w:t>de</w:t>
+      </w:r>
+      <w:r>
+        <w:t xml:space="preserve"> EGFR y </w:t>
+      </w:r>
+      <w:r>
+        <w:t xml:space="preserve">reordenamiento de </w:t>
+      </w:r>
+      <w:r>
+        <w:t xml:space="preserve">ALK tienen un valor pronóstico y predictivo bien establecido </w:t>
+      </w:r>
+      <w:r>
+        <w:fldChar w:fldCharType="begin"/>
+      </w:r>
+      <w:r>
+        <w:instrText xml:space="preserve"> ADDIN ZOTERO_ITEM CSL_CITATION {"citationID":"MeBdsq0P","properties":{"unsorted":false,"formattedCitation":"(Cardarella y Johnson 2013)","plainCitation":"(Cardarella y Johnson 2013)","noteIndex":0},"citationItems":[{"id":11,"uris":["http://zotero.org/users/19775897/items/LFQMB3CP"],"itemData":{"id":11,"type":"article-journal","abstract":"The remarkable success of epidermal growth factor receptor (EGFR) and anaplastic lymphoma kinase (ALK) tyrosine kinase inhibitors in patients with EGFR mutations and ALK rearrangements, respectively, introduced the era of targeted therapy in advanced non-small cell lung cancer (NSCLC), shifting treatment from platinum-based combination chemotherapy to molecularly tailored therapy. Recent genomic studies in lung adenocarcinoma identified other potential therapeutic targets, including ROS1 rearrangements, RET fusions, MET amplification, and activating mutations in BRAF, HER2, and KRAS in frequencies exceeding 1%. Lung cancers that harbor these genomic changes can potentially be targeted with agents approved for other indications or under clinical development. The need to generate increasing amounts of genomic information should prompt health-care providers to be mindful of the amounts of tissue needed for these assays when planning diagnostic procedures. In this review, we summarize oncogenic drivers in NSCLC that can be currently detected, highlight their potential therapeutic implications, and discuss practical considerations for successful application of tumor genotyping in clinical decision making.","container-title":"American Journal of Respiratory and Critical Care Medicine","DOI":"10.1164/rccm.201305-0843PP","ISSN":"1073-449X","issue":"7","journalAbbreviation":"Am J Respir Crit Care Med","page":"770-775","publisher":"American Thoracic Society - AJRCCM","source":"atsjournals.org (Atypon)","title":"The Impact of Genomic Changes on Treatment of Lung Cancer","volume":"188","author":[{"family":"Cardarella","given":"Stephanie"},{"family":"Johnson","given":"Bruce E."}],"issued":{"date-parts":[["2013",10]]}}}],"schema":"https://github.com/citation-style-language/schema/raw/master/csl-citation.json"} </w:instrText>
+      </w:r>
+      <w:r>
+        <w:fldChar w:fldCharType="separate"/>
+      </w:r>
+      <w:r>
+        <w:rPr>
+          <w:rFonts w:ascii="Calibri" w:hAnsi="Calibri" w:cs="Calibri"/>
+        </w:rPr>
+        <w:t>(</w:t>
+      </w:r>
+      <w:proofErr w:type="spellStart"/>
+      <w:r>
+        <w:rPr>
+          <w:rFonts w:ascii="Calibri" w:hAnsi="Calibri" w:cs="Calibri"/>
+        </w:rPr>
+        <w:t>Cardarella</w:t>
+      </w:r>
+      <w:proofErr w:type="spellEnd"/>
+      <w:r>
+        <w:rPr>
+          <w:rFonts w:ascii="Calibri" w:hAnsi="Calibri" w:cs="Calibri"/>
+        </w:rPr>
+        <w:t xml:space="preserve"> y Johnson 2013)</w:t>
+      </w:r>
+      <w:r>
+        <w:fldChar w:fldCharType="end"/>
+      </w:r>
+      <w:r>
+        <w:t>, en cáncer de mama las mutaciones somáticas aportan información incremental modesta sobre la que ya proporciona la expresión génica</w:t>
+      </w:r>
       <w:r>
         <w:t xml:space="preserve"> </w:t>
       </w:r>
-      <w:proofErr w:type="spellStart"/>
-      <w:r>
-        <w:t>Cancer</w:t>
-      </w:r>
-      <w:proofErr w:type="spellEnd"/>
-      <w:r>
-        <w:t xml:space="preserve"> </w:t>
-      </w:r>
-      <w:proofErr w:type="spellStart"/>
-      <w:r>
-        <w:t>Genome</w:t>
-      </w:r>
-      <w:proofErr w:type="spellEnd"/>
-      <w:r>
-        <w:t xml:space="preserve"> Atlas (TCGA), lanzado en 2006 por el </w:t>
-      </w:r>
-      <w:proofErr w:type="spellStart"/>
-      <w:r>
-        <w:t>National</w:t>
-      </w:r>
-      <w:proofErr w:type="spellEnd"/>
-      <w:r>
-        <w:t xml:space="preserve"> </w:t>
-      </w:r>
-      <w:proofErr w:type="spellStart"/>
-      <w:r>
-        <w:t>Cancer</w:t>
-      </w:r>
-      <w:proofErr w:type="spellEnd"/>
-      <w:r>
-        <w:t xml:space="preserve"> </w:t>
-      </w:r>
-      <w:proofErr w:type="spellStart"/>
-      <w:r>
-        <w:t>Institute</w:t>
-      </w:r>
-      <w:proofErr w:type="spellEnd"/>
-      <w:r>
-        <w:t xml:space="preserve"> (NCI) y el </w:t>
-      </w:r>
-      <w:proofErr w:type="spellStart"/>
-      <w:r>
-        <w:t>National</w:t>
-      </w:r>
-      <w:proofErr w:type="spellEnd"/>
-      <w:r>
-        <w:t xml:space="preserve"> Human </w:t>
-      </w:r>
-      <w:proofErr w:type="spellStart"/>
-      <w:r>
-        <w:t>Genome</w:t>
-      </w:r>
-      <w:proofErr w:type="spellEnd"/>
-      <w:r>
-        <w:t xml:space="preserve"> </w:t>
-      </w:r>
-      <w:proofErr w:type="spellStart"/>
-      <w:r>
-        <w:t>Research</w:t>
-      </w:r>
-      <w:proofErr w:type="spellEnd"/>
-      <w:r>
-        <w:t xml:space="preserve"> </w:t>
-      </w:r>
-      <w:proofErr w:type="spellStart"/>
-      <w:r>
-        <w:t>Institute</w:t>
-      </w:r>
-      <w:proofErr w:type="spellEnd"/>
-      <w:r>
-        <w:t xml:space="preserve"> (NHGRI) de los Estados Unidos, </w:t>
-      </w:r>
-      <w:r>
-        <w:rPr>
-          <w:rFonts w:ascii="Arial" w:hAnsi="Arial"/>
-          <w:sz w:val="22"/>
-        </w:rPr>
-        <w:t>ha generado perfiles moleculares completos de más de 11.000 tumores en 33 tipos de cáncer. La estandarización de los pipelines de procesamiento a través del GDC Data Portal [20] ha resuelto parcialmente el problema de la heterogeneidad entre estudios, permitiendo el análisis comparativo entre tipos de cáncer con protocolos uniformes. Una limitación reconocida es la sobrerrepresentación de pacientes de ancestría europea (~70-80%), lo que puede afectar a la generalización de los modelos en poblaciones más diversas.</w:t>
-      </w:r>
+      <w:r>
+        <w:fldChar w:fldCharType="begin"/>
+      </w:r>
+      <w:r>
+        <w:instrText xml:space="preserve"> ADDIN ZOTERO_ITEM CSL_CITATION {"citationID":"GrucFznx","properties":{"unsorted":false,"formattedCitation":"(Kandoth et\\uc0\\u160{}al. 2013)","plainCitation":"(Kandoth et al. 2013)","noteIndex":0},"citationItems":[{"id":185,"uris":["http://zotero.org/users/19775897/items/NC56X66D"],"itemData":{"id":185,"type":"article-journal","abstract":"The Cancer Genome Atlas (TCGA) has used the latest sequencing and analysis methods to identify somatic variants across thousands of tumours. Here we present data and analytical results for point mutations and small insertions/deletions from 3,281 tumours across 12 tumour types as part of the TCGA Pan-Cancer effort. We illustrate the distributions of mutation frequencies, types and contexts across tumour types, and establish their links to tissues of origin, environmental/carcinogen influences, and DNA repair defects. Using the integrated data sets, we identified 127 significantly mutated genes from well-known (for example, mitogen-activated protein kinase, phosphatidylinositol-3-OH kinase, Wnt/β-catenin and receptor tyrosine kinase signalling pathways, and cell cycle control) and emerging (for example, histone, histone modification, splicing, metabolism and proteolysis) cellular processes in cancer. The average number of mutations in these significantly mutated genes varies across tumour types; most tumours have two to six, indicating that the number of driver mutations required during oncogenesis is relatively small. Mutations in transcriptional factors/regulators show tissue specificity, whereas histone modifiers are often mutated across several cancer types. Clinical association analysis identifies genes having a significant effect on survival, and investigations of mutations with respect to clonal/subclonal architecture delineate their temporal orders during tumorigenesis. Taken together, these results lay the groundwork for developing new diagnostics and individualizing cancer treatment.","container-title":"Nature","DOI":"10.1038/nature12634","ISSN":"1476-4687","issue":"7471","language":"en","license":"2013 The Author(s)","page":"333-339","publisher":"Nature Publishing Group","source":"www.nature.com","title":"Mutational landscape and significance across 12 major cancer types","volume":"502","author":[{"family":"Kandoth","given":"Cyriac"},{"family":"McLellan","given":"Michael D."},{"family":"Vandin","given":"Fabio"},{"family":"Ye","given":"Kai"},{"family":"Niu","given":"Beifang"},{"family":"Lu","given":"Charles"},{"family":"Xie","given":"Mingchao"},{"family":"Zhang","given":"Qunyuan"},{"family":"McMichael","given":"Joshua F."},{"family":"Wyczalkowski","given":"Matthew A."},{"family":"Leiserson","given":"Mark D. M."},{"family":"Miller","given":"Christopher A."},{"family":"Welch","given":"John S."},{"family":"Walter","given":"Matthew J."},{"family":"Wendl","given":"Michael C."},{"family":"Ley","given":"Timothy J."},{"family":"Wilson","given":"Richard K."},{"family":"Raphael","given":"Benjamin J."},{"family":"Ding","given":"Li"}],"issued":{"date-parts":[["2013",10]]}}}],"schema":"https://github.com/citation-style-language/schema/raw/master/csl-citation.json"} </w:instrText>
+      </w:r>
+      <w:r>
+        <w:fldChar w:fldCharType="separate"/>
+      </w:r>
+      <w:r>
+        <w:rPr>
+          <w:rFonts w:ascii="Calibri" w:hAnsi="Calibri" w:cs="Calibri"/>
+          <w:szCs w:val="24"/>
+        </w:rPr>
+        <w:t>(</w:t>
+      </w:r>
+      <w:proofErr w:type="spellStart"/>
+      <w:r>
+        <w:rPr>
+          <w:rFonts w:ascii="Calibri" w:hAnsi="Calibri" w:cs="Calibri"/>
+          <w:szCs w:val="24"/>
+        </w:rPr>
+        <w:t>Kandoth</w:t>
+      </w:r>
+      <w:proofErr w:type="spellEnd"/>
+      <w:r>
+        <w:rPr>
+          <w:rFonts w:ascii="Calibri" w:hAnsi="Calibri" w:cs="Calibri"/>
+          <w:szCs w:val="24"/>
+        </w:rPr>
+        <w:t xml:space="preserve"> et al. 2013)</w:t>
+      </w:r>
+      <w:r>
+        <w:fldChar w:fldCharType="end"/>
+      </w:r>
+      <w:r>
+        <w:t>. Este fenómeno se explica porque las mutaciones son eventos discretos y su frecuencia de ocurrencia individual es baja en la mayoría de los genes (excepto en genes conductores), mientras que la expresión génica integra el efecto de múltiples alteraciones moleculares aguas abajo.</w:t>
+      </w:r>
+      <w:bookmarkStart w:id="5" w:name="_Toc224126724"/>
     </w:p>
     <w:p>
       <w:pPr>
@@ -11711,368 +13484,8 @@
     </w:p>
     <w:p>
       <w:pPr>
-        <w:pStyle w:val="Ttulo3"/>
-      </w:pPr>
-      <w:bookmarkStart w:id="3" w:name="_Toc224126722"/>
-      <w:r>
-        <w:t>2.</w:t>
-      </w:r>
-      <w:r>
-        <w:t>5</w:t>
-      </w:r>
-      <w:r>
-        <w:t xml:space="preserve">.2 El </w:t>
-      </w:r>
-      <w:proofErr w:type="spellStart"/>
-      <w:r>
-        <w:t>dataset</w:t>
-      </w:r>
-      <w:proofErr w:type="spellEnd"/>
-      <w:r>
-        <w:t xml:space="preserve"> METABRIC</w:t>
-      </w:r>
-      <w:bookmarkEnd w:id="3"/>
-    </w:p>
-    <w:p>
-      <w:pPr>
-        <w:spacing w:after="160"/>
-      </w:pPr>
-      <w:r>
-        <w:t xml:space="preserve">El Molecular </w:t>
-      </w:r>
-      <w:proofErr w:type="spellStart"/>
-      <w:r>
-        <w:t>Taxonomy</w:t>
-      </w:r>
-      <w:proofErr w:type="spellEnd"/>
-      <w:r>
-        <w:t xml:space="preserve"> </w:t>
-      </w:r>
-      <w:proofErr w:type="spellStart"/>
-      <w:r>
-        <w:t>of</w:t>
-      </w:r>
-      <w:proofErr w:type="spellEnd"/>
-      <w:r>
-        <w:t xml:space="preserve"> </w:t>
-      </w:r>
-      <w:proofErr w:type="spellStart"/>
-      <w:r>
-        <w:t>Breast</w:t>
-      </w:r>
-      <w:proofErr w:type="spellEnd"/>
-      <w:r>
-        <w:t xml:space="preserve"> </w:t>
-      </w:r>
-      <w:proofErr w:type="spellStart"/>
-      <w:r>
-        <w:t>Cancer</w:t>
-      </w:r>
-      <w:proofErr w:type="spellEnd"/>
-      <w:r>
-        <w:t xml:space="preserve"> International </w:t>
-      </w:r>
-      <w:proofErr w:type="spellStart"/>
-      <w:r>
-        <w:t>Consortium</w:t>
-      </w:r>
-      <w:proofErr w:type="spellEnd"/>
-      <w:r>
-        <w:t xml:space="preserve"> (METABRIC) </w:t>
-      </w:r>
-      <w:r>
-        <w:rPr>
-          <w:color w:val="FF0000"/>
-        </w:rPr>
-        <w:t>[</w:t>
-      </w:r>
-      <w:r>
-        <w:rPr>
-          <w:color w:val="FF0000"/>
-        </w:rPr>
-        <w:t xml:space="preserve">METABRIC </w:t>
-      </w:r>
-      <w:proofErr w:type="spellStart"/>
-      <w:r>
-        <w:rPr>
-          <w:color w:val="FF0000"/>
-        </w:rPr>
-        <w:t>webpage</w:t>
-      </w:r>
-      <w:proofErr w:type="spellEnd"/>
-      <w:r>
-        <w:rPr>
-          <w:color w:val="FF0000"/>
-        </w:rPr>
-        <w:t>]</w:t>
-      </w:r>
-      <w:r>
-        <w:rPr>
-          <w:color w:val="FF0000"/>
-        </w:rPr>
-        <w:t xml:space="preserve"> [21]</w:t>
-      </w:r>
-      <w:r>
-        <w:rPr>
-          <w:color w:val="FF0000"/>
-        </w:rPr>
-        <w:t xml:space="preserve"> </w:t>
-      </w:r>
-      <w:bookmarkStart w:id="4" w:name="_Toc224126723"/>
-      <w:r>
-        <w:rPr>
-          <w:rFonts w:ascii="Arial" w:hAnsi="Arial"/>
-          <w:sz w:val="22"/>
-        </w:rPr>
-        <w:t xml:space="preserve">incluye perfiles de </w:t>
-      </w:r>
-      <w:proofErr w:type="spellStart"/>
-      <w:r>
-        <w:rPr>
-          <w:rFonts w:ascii="Arial" w:hAnsi="Arial"/>
-          <w:sz w:val="22"/>
-        </w:rPr>
-        <w:t>microarrays</w:t>
-      </w:r>
-      <w:proofErr w:type="spellEnd"/>
-      <w:r>
-        <w:rPr>
-          <w:rFonts w:ascii="Arial" w:hAnsi="Arial"/>
-          <w:sz w:val="22"/>
-        </w:rPr>
-        <w:t xml:space="preserve"> de expresión génica, datos de CNV y variables clínicas exhaustivas de 1.980 pacientes con cáncer de mama, con seguimiento hasta 30 años. </w:t>
-      </w:r>
-      <w:r>
-        <w:t>Curtis et al. en 2012 [21]</w:t>
-      </w:r>
-      <w:r>
-        <w:rPr>
-          <w:rFonts w:ascii="Arial" w:hAnsi="Arial"/>
-          <w:sz w:val="22"/>
-        </w:rPr>
-        <w:t xml:space="preserve"> identificaron 10 subgrupos moleculares (IntClust1-10) con perfiles de supervivencia diferenciados, con mayor valor pronóstico que la clasificación TNM convencional. La diferencia en la tecnología de perfilado respecto a TCGA (</w:t>
-      </w:r>
-      <w:proofErr w:type="spellStart"/>
-      <w:r>
-        <w:rPr>
-          <w:rFonts w:ascii="Arial" w:hAnsi="Arial"/>
-          <w:sz w:val="22"/>
-        </w:rPr>
-        <w:t>microarrays</w:t>
-      </w:r>
-      <w:proofErr w:type="spellEnd"/>
-      <w:r>
-        <w:rPr>
-          <w:rFonts w:ascii="Arial" w:hAnsi="Arial"/>
-          <w:sz w:val="22"/>
-        </w:rPr>
-        <w:t xml:space="preserve"> vs. RNA-</w:t>
-      </w:r>
-      <w:proofErr w:type="spellStart"/>
-      <w:r>
-        <w:rPr>
-          <w:rFonts w:ascii="Arial" w:hAnsi="Arial"/>
-          <w:sz w:val="22"/>
-        </w:rPr>
-        <w:t>seq</w:t>
-      </w:r>
-      <w:proofErr w:type="spellEnd"/>
-      <w:r>
-        <w:rPr>
-          <w:rFonts w:ascii="Arial" w:hAnsi="Arial"/>
-          <w:sz w:val="22"/>
-        </w:rPr>
-        <w:t>) introduce diferencias sistemáticas que requieren tratamiento específico mediante corrección de efectos de lote [23].</w:t>
-      </w:r>
-      <w:r>
-        <w:t>2.5.3 Tipos de datos genómicos y su contribución pronóstica</w:t>
-      </w:r>
-      <w:bookmarkEnd w:id="4"/>
-    </w:p>
-    <w:p>
-      <w:pPr>
-        <w:pStyle w:val="Ttulo3"/>
-      </w:pPr>
-      <w:r>
-        <w:t>2.</w:t>
-      </w:r>
-      <w:r>
-        <w:t>5</w:t>
-      </w:r>
-      <w:r>
-        <w:t>.3 Cobertura de datos y diferencias de plataforma</w:t>
-      </w:r>
-    </w:p>
-    <w:p>
-      <w:pPr>
-        <w:spacing w:after="160"/>
-      </w:pPr>
-      <w:r>
-        <w:rPr>
-          <w:rFonts w:ascii="Arial" w:hAnsi="Arial"/>
-          <w:sz w:val="22"/>
-        </w:rPr>
-        <w:t>La Figura 3 resume visualmente las diferencias en la cobertura de datos disponibles entre TCGA y METABRIC, así como los tipos de datos compartidos que sirven de base para el análisis comparativo.</w:t>
-      </w:r>
-    </w:p>
-    <w:p>
-      <w:pPr>
-        <w:spacing w:after="80"/>
-      </w:pPr>
-    </w:p>
-    <w:p>
-      <w:pPr>
-        <w:spacing w:after="80"/>
-        <w:jc w:val="center"/>
-      </w:pPr>
-      <w:r>
-        <w:rPr>
-          <w:noProof/>
-        </w:rPr>
-        <w:lastRenderedPageBreak/>
-        <w:drawing>
-          <wp:inline distT="0" distB="0" distL="0" distR="0" wp14:anchorId="6F50889C" wp14:editId="7F95A91A">
-            <wp:extent cx="5334000" cy="2667000"/>
-            <wp:effectExtent l="0" t="0" r="0" b="0"/>
-            <wp:docPr id="13" name="Imagen 13"/>
-            <wp:cNvGraphicFramePr>
-              <a:graphicFrameLocks xmlns:a="http://schemas.openxmlformats.org/drawingml/2006/main" noChangeAspect="1"/>
-            </wp:cNvGraphicFramePr>
-            <a:graphic xmlns:a="http://schemas.openxmlformats.org/drawingml/2006/main">
-              <a:graphicData uri="http://schemas.openxmlformats.org/drawingml/2006/picture">
-                <pic:pic xmlns:pic="http://schemas.openxmlformats.org/drawingml/2006/picture">
-                  <pic:nvPicPr>
-                    <pic:cNvPr id="0" name=""/>
-                    <pic:cNvPicPr>
-                      <a:picLocks noChangeAspect="1" noChangeArrowheads="1"/>
-                    </pic:cNvPicPr>
-                  </pic:nvPicPr>
-                  <pic:blipFill>
-                    <a:blip r:embed="rId15"/>
-                    <a:srcRect/>
-                    <a:stretch>
-                      <a:fillRect/>
-                    </a:stretch>
-                  </pic:blipFill>
-                  <pic:spPr bwMode="auto">
-                    <a:xfrm>
-                      <a:off x="0" y="0"/>
-                      <a:ext cx="5334000" cy="2667000"/>
-                    </a:xfrm>
-                    <a:prstGeom prst="rect">
-                      <a:avLst/>
-                    </a:prstGeom>
-                  </pic:spPr>
-                </pic:pic>
-              </a:graphicData>
-            </a:graphic>
-          </wp:inline>
-        </w:drawing>
-      </w:r>
-    </w:p>
-    <w:p>
-      <w:pPr>
-        <w:pStyle w:val="Descripcin"/>
-      </w:pPr>
-      <w:r>
-        <w:t xml:space="preserve">Figura </w:t>
-      </w:r>
-      <w:fldSimple w:instr=" SEQ Figura \* ARABIC ">
-        <w:r>
-          <w:rPr>
-            <w:noProof/>
-          </w:rPr>
-          <w:t>3</w:t>
-        </w:r>
-      </w:fldSimple>
-      <w:r>
-        <w:t xml:space="preserve">. </w:t>
-      </w:r>
-      <w:r>
-        <w:t xml:space="preserve">Cobertura comparativa de datos disponibles en TCGA y METABRIC. La zona central (verde) representa los tipos de datos disponibles en ambos </w:t>
-      </w:r>
-      <w:proofErr w:type="spellStart"/>
-      <w:r>
-        <w:t>datasets</w:t>
-      </w:r>
-      <w:proofErr w:type="spellEnd"/>
-      <w:r>
-        <w:t xml:space="preserve"> y que constituyen la base del análisis comparativo. La diferencia de plataforma tecnológica (RNA-</w:t>
-      </w:r>
-      <w:proofErr w:type="spellStart"/>
-      <w:r>
-        <w:t>seq</w:t>
-      </w:r>
-      <w:proofErr w:type="spellEnd"/>
-      <w:r>
-        <w:t xml:space="preserve"> vs.</w:t>
-      </w:r>
-      <w:r>
-        <w:t xml:space="preserve"> </w:t>
-      </w:r>
-      <w:proofErr w:type="spellStart"/>
-      <w:r>
-        <w:t>Microarrays</w:t>
-      </w:r>
-      <w:proofErr w:type="spellEnd"/>
-      <w:r>
-        <w:t xml:space="preserve">) requiere corrección de </w:t>
-      </w:r>
-      <w:proofErr w:type="spellStart"/>
-      <w:r>
-        <w:t>batch</w:t>
-      </w:r>
-      <w:proofErr w:type="spellEnd"/>
-      <w:r>
-        <w:t xml:space="preserve"> </w:t>
-      </w:r>
-      <w:proofErr w:type="spellStart"/>
-      <w:r>
-        <w:t>effect</w:t>
-      </w:r>
-      <w:proofErr w:type="spellEnd"/>
-      <w:r>
-        <w:t xml:space="preserve"> antes del análisis conjunto.</w:t>
-      </w:r>
-    </w:p>
-    <w:p>
-      <w:pPr>
-        <w:spacing w:after="160"/>
-      </w:pPr>
-      <w:r>
-        <w:rPr>
-          <w:rFonts w:ascii="Arial" w:hAnsi="Arial"/>
-          <w:sz w:val="22"/>
-        </w:rPr>
-        <w:t xml:space="preserve">La contribución relativa de cada modalidad a la capacidad predictiva varía según el tipo de cáncer: la expresión génica es consistentemente la más informativa, seguida de </w:t>
-      </w:r>
-      <w:proofErr w:type="spellStart"/>
-      <w:r>
-        <w:rPr>
-          <w:rFonts w:ascii="Arial" w:hAnsi="Arial"/>
-          <w:sz w:val="22"/>
-        </w:rPr>
-        <w:t>miRNA</w:t>
-      </w:r>
-      <w:proofErr w:type="spellEnd"/>
-      <w:r>
-        <w:rPr>
-          <w:rFonts w:ascii="Arial" w:hAnsi="Arial"/>
-          <w:sz w:val="22"/>
-        </w:rPr>
-        <w:t>, metilación y CNV [17]. Las mutaciones somáticas tienen contribución más heterogénea, siendo especialmente relevantes en NSCLC (EGFR, KRAS, ALK) pero con aportación incremental modesta en cáncer de mama, donde la expresión génica ya integra el efecto de múltiples alteraciones moleculares aguas abajo [24].</w:t>
-      </w:r>
-    </w:p>
-    <w:p>
-      <w:pPr>
-        <w:spacing w:after="100"/>
-      </w:pPr>
-    </w:p>
-    <w:p>
-      <w:pPr>
         <w:pStyle w:val="Ttulo2"/>
       </w:pPr>
-      <w:bookmarkStart w:id="5" w:name="_Toc224126724"/>
       <w:r>
         <w:t>2.</w:t>
       </w:r>
@@ -12129,7 +13542,15 @@
           <w:rFonts w:ascii="Arial" w:hAnsi="Arial"/>
           <w:sz w:val="22"/>
         </w:rPr>
-        <w:t xml:space="preserve"> et al. (2000) [22] en cuatro subtipos intrínsecos (Luminal A, Luminal B, HER2-enriched y Triple Negativo) mediante perfiles de expresión génica demostró un mayor valor pronóstico que la estadificación TNM convencional, con tasas de supervivencia a 5 años que oscilan entre el 92% para Luminal A y el 77% para Triple Negativo en estadios tempranos [25]. La integración de marcadores genómicos en puntuaciones de riesgo clínicamente validadas como </w:t>
+        <w:t xml:space="preserve"> et al. (2000) [22] en cuatro subtipos intrínsecos (Luminal A, Luminal B, HER2-enriched y Triple Negativo) mediante perfiles de </w:t>
+      </w:r>
+      <w:r>
+        <w:rPr>
+          <w:rFonts w:ascii="Arial" w:hAnsi="Arial"/>
+          <w:sz w:val="22"/>
+        </w:rPr>
+        <w:lastRenderedPageBreak/>
+        <w:t xml:space="preserve">expresión génica demostró un mayor valor pronóstico que la estadificación TNM convencional, con tasas de supervivencia a 5 años que oscilan entre el 92% para Luminal A y el 77% para Triple Negativo en estadios tempranos [25]. La integración de marcadores genómicos en puntuaciones de riesgo clínicamente validadas como </w:t>
       </w:r>
       <w:proofErr w:type="spellStart"/>
       <w:r>
@@ -12342,15 +13763,7 @@
           <w:rFonts w:ascii="Arial" w:hAnsi="Arial"/>
           <w:sz w:val="22"/>
         </w:rPr>
-        <w:t xml:space="preserve"> </w:t>
-      </w:r>
-      <w:r>
-        <w:rPr>
-          <w:rFonts w:ascii="Arial" w:hAnsi="Arial"/>
-          <w:sz w:val="22"/>
-        </w:rPr>
-        <w:lastRenderedPageBreak/>
-        <w:t>alcanzaba el mayor C-</w:t>
+        <w:t xml:space="preserve"> alcanzaba el mayor C-</w:t>
       </w:r>
       <w:proofErr w:type="spellStart"/>
       <w:r>
@@ -13630,6 +15043,7 @@
                 <w:sz w:val="20"/>
                 <w:szCs w:val="20"/>
               </w:rPr>
+              <w:lastRenderedPageBreak/>
               <w:t>Tong</w:t>
             </w:r>
             <w:proofErr w:type="spellEnd"/>
@@ -13846,49 +15260,21 @@
           <w:rFonts w:ascii="Arial" w:hAnsi="Arial"/>
           <w:sz w:val="22"/>
         </w:rPr>
-        <w:t>abarca el 85% de todos los cánceres de pulmón y se subdivide en adenocarcinoma (LUAD, ~40%), carcinoma escamoso (LUSC, ~25%) y carcinoma de células grandes (~10%). Esta heterogeneidad histológica se corresponde con perfiles moleculares y pronósticos distintos. En LUAD</w:t>
+        <w:t>abarca el 85% de todos los cánceres de pulmón y se subdivide en adenocarcinoma (LUAD, ~40%), carcinoma escamoso (LUSC, ~25%) y carcinoma de células grandes (~10%). Esta heterogeneidad histológica se corresponde con perfiles moleculares y pronósticos distintos. En LUAD [33], las mutaciones en EGFR, los reordenamientos de ALK y ROS1, y las mutaciones en KRAS son marcadores de tratamiento dirigido validados. En LUSC [</w:t>
       </w:r>
       <w:r>
         <w:rPr>
           <w:rFonts w:ascii="Arial" w:hAnsi="Arial"/>
           <w:sz w:val="22"/>
         </w:rPr>
-        <w:t xml:space="preserve"> [33]</w:t>
+        <w:t xml:space="preserve">24, </w:t>
       </w:r>
       <w:r>
         <w:rPr>
           <w:rFonts w:ascii="Arial" w:hAnsi="Arial"/>
           <w:sz w:val="22"/>
         </w:rPr>
-        <w:t>, las mutaciones en EGFR, los reordenamientos de ALK y ROS1, y las mutaciones en KRAS son marcadores de tratamiento dirigido validados. En LUSC</w:t>
-      </w:r>
-      <w:r>
-        <w:rPr>
-          <w:rFonts w:ascii="Arial" w:hAnsi="Arial"/>
-          <w:sz w:val="22"/>
-        </w:rPr>
-        <w:t xml:space="preserve"> [</w:t>
-      </w:r>
-      <w:r>
-        <w:rPr>
-          <w:rFonts w:ascii="Arial" w:hAnsi="Arial"/>
-          <w:sz w:val="22"/>
-        </w:rPr>
-        <w:t xml:space="preserve">24, </w:t>
-      </w:r>
-      <w:r>
-        <w:rPr>
-          <w:rFonts w:ascii="Arial" w:hAnsi="Arial"/>
-          <w:sz w:val="22"/>
-        </w:rPr>
-        <w:t>34]</w:t>
-      </w:r>
-      <w:r>
-        <w:rPr>
-          <w:rFonts w:ascii="Arial" w:hAnsi="Arial"/>
-          <w:sz w:val="22"/>
-        </w:rPr>
-        <w:t>, las alteraciones en FGFR1, DDR2 y PIK3CA son los targets más prometedores.</w:t>
+        <w:t>34], las alteraciones en FGFR1, DDR2 y PIK3CA son los targets más prometedores.</w:t>
       </w:r>
     </w:p>
     <w:p>
@@ -13902,7 +15288,6 @@
       </w:pPr>
       <w:bookmarkStart w:id="13" w:name="_Toc224126730"/>
       <w:r>
-        <w:lastRenderedPageBreak/>
         <w:t>2.</w:t>
       </w:r>
       <w:r>
@@ -14479,6 +15864,7 @@
                 <w:sz w:val="20"/>
                 <w:szCs w:val="20"/>
               </w:rPr>
+              <w:lastRenderedPageBreak/>
               <w:t>TCGA LUAD Network (2014) [33]</w:t>
             </w:r>
           </w:p>
@@ -15506,6 +16892,7 @@
         </w:rPr>
       </w:pPr>
       <w:r>
+        <w:lastRenderedPageBreak/>
         <w:t xml:space="preserve">En el ámbito específico de cáncer de mama con datos genómicos, la combinación TCGA-BRCA + METABRIC es la más frecuentemente utilizada para validación cruzada. La diferencia fundamental entre ambos </w:t>
       </w:r>
       <w:proofErr w:type="spellStart"/>
@@ -15690,7 +17077,6 @@
       </w:pPr>
       <w:bookmarkStart w:id="19" w:name="_Toc224126737"/>
       <w:r>
-        <w:lastRenderedPageBreak/>
         <w:t>2.9.1 El índice de concordancia (C-</w:t>
       </w:r>
       <w:proofErr w:type="spellStart"/>
@@ -15814,7 +17200,11 @@
       </w:r>
       <w:proofErr w:type="spellEnd"/>
       <w:r>
-        <w:t xml:space="preserve"> Score sobre todos los tiempos del horizonte de seguimiento, proporcionando una medida conjunta de calibración y discriminación. Un IBS de 0 indica predicción perfecta, un IBS de 0,25 corresponde al score de un modelo que asigna P(supervivencia) = 0,5 a todos los sujetos independientemente de sus características (modelo nulo). En la práctica, los modelos bien calibrados en datos oncológicos alcanzan IBS en el rango 0,15-0,22.</w:t>
+        <w:t xml:space="preserve"> Score sobre todos los tiempos del horizonte de seguimiento, proporcionando una medida conjunta de calibración y discriminación. Un IBS de 0 indica predicción perfecta, un IBS de 0,25 corresponde al score de un modelo que asigna P(supervivencia) = 0,5 a todos los sujetos </w:t>
+      </w:r>
+      <w:r>
+        <w:lastRenderedPageBreak/>
+        <w:t>independientemente de sus características (modelo nulo). En la práctica, los modelos bien calibrados en datos oncológicos alcanzan IBS en el rango 0,15-0,22.</w:t>
       </w:r>
     </w:p>
     <w:p>
@@ -15962,7 +17352,7 @@
                     </pic:cNvPicPr>
                   </pic:nvPicPr>
                   <pic:blipFill>
-                    <a:blip r:embed="rId16"/>
+                    <a:blip r:embed="rId15"/>
                     <a:srcRect/>
                     <a:stretch>
                       <a:fillRect/>
@@ -16084,6 +17474,7 @@
           <w:rFonts w:ascii="Arial" w:hAnsi="Arial"/>
           <w:sz w:val="22"/>
         </w:rPr>
+        <w:lastRenderedPageBreak/>
         <w:t>La Tabla 3 sintetiza, en una única vista transversal, las principales técnicas y líneas de trabajo analizadas a lo largo del capítulo, junto con sus características metodológicas y su relevancia específica para el diseño del presente TFM.</w:t>
       </w:r>
     </w:p>
@@ -16150,12 +17541,6 @@
         <w:gridCol w:w="1301"/>
       </w:tblGrid>
       <w:tr>
-        <w:tblPrEx>
-          <w:tblCellMar>
-            <w:top w:w="0" w:type="dxa"/>
-            <w:bottom w:w="0" w:type="dxa"/>
-          </w:tblCellMar>
-        </w:tblPrEx>
         <w:tc>
           <w:tcPr>
             <w:tcW w:w="1200" w:type="dxa"/>
@@ -16534,12 +17919,6 @@
         </w:tc>
       </w:tr>
       <w:tr>
-        <w:tblPrEx>
-          <w:tblCellMar>
-            <w:top w:w="0" w:type="dxa"/>
-            <w:bottom w:w="0" w:type="dxa"/>
-          </w:tblCellMar>
-        </w:tblPrEx>
         <w:trPr>
           <w:gridAfter w:val="8"/>
           <w:wAfter w:w="7600" w:type="dxa"/>
@@ -16581,12 +17960,6 @@
         </w:tc>
       </w:tr>
       <w:tr>
-        <w:tblPrEx>
-          <w:tblCellMar>
-            <w:top w:w="0" w:type="dxa"/>
-            <w:bottom w:w="0" w:type="dxa"/>
-          </w:tblCellMar>
-        </w:tblPrEx>
         <w:tc>
           <w:tcPr>
             <w:tcW w:w="1200" w:type="dxa"/>
@@ -16853,12 +18226,6 @@
         </w:tc>
       </w:tr>
       <w:tr>
-        <w:tblPrEx>
-          <w:tblCellMar>
-            <w:top w:w="0" w:type="dxa"/>
-            <w:bottom w:w="0" w:type="dxa"/>
-          </w:tblCellMar>
-        </w:tblPrEx>
         <w:tc>
           <w:tcPr>
             <w:tcW w:w="1200" w:type="dxa"/>
@@ -17115,12 +18482,6 @@
         </w:tc>
       </w:tr>
       <w:tr>
-        <w:tblPrEx>
-          <w:tblCellMar>
-            <w:top w:w="0" w:type="dxa"/>
-            <w:bottom w:w="0" w:type="dxa"/>
-          </w:tblCellMar>
-        </w:tblPrEx>
         <w:tc>
           <w:tcPr>
             <w:tcW w:w="1200" w:type="dxa"/>
@@ -17387,12 +18748,6 @@
         </w:tc>
       </w:tr>
       <w:tr>
-        <w:tblPrEx>
-          <w:tblCellMar>
-            <w:top w:w="0" w:type="dxa"/>
-            <w:bottom w:w="0" w:type="dxa"/>
-          </w:tblCellMar>
-        </w:tblPrEx>
         <w:trPr>
           <w:gridAfter w:val="8"/>
           <w:wAfter w:w="7600" w:type="dxa"/>
@@ -17428,7 +18783,6 @@
                 <w:sz w:val="18"/>
                 <w:szCs w:val="18"/>
               </w:rPr>
-              <w:lastRenderedPageBreak/>
               <w:t xml:space="preserve">Machine </w:t>
             </w:r>
             <w:proofErr w:type="spellStart"/>
@@ -17459,12 +18813,6 @@
         </w:tc>
       </w:tr>
       <w:tr>
-        <w:tblPrEx>
-          <w:tblCellMar>
-            <w:top w:w="0" w:type="dxa"/>
-            <w:bottom w:w="0" w:type="dxa"/>
-          </w:tblCellMar>
-        </w:tblPrEx>
         <w:tc>
           <w:tcPr>
             <w:tcW w:w="1200" w:type="dxa"/>
@@ -17783,12 +19131,6 @@
         </w:tc>
       </w:tr>
       <w:tr>
-        <w:tblPrEx>
-          <w:tblCellMar>
-            <w:top w:w="0" w:type="dxa"/>
-            <w:bottom w:w="0" w:type="dxa"/>
-          </w:tblCellMar>
-        </w:tblPrEx>
         <w:tc>
           <w:tcPr>
             <w:tcW w:w="1200" w:type="dxa"/>
@@ -18089,12 +19431,6 @@
         </w:tc>
       </w:tr>
       <w:tr>
-        <w:tblPrEx>
-          <w:tblCellMar>
-            <w:top w:w="0" w:type="dxa"/>
-            <w:bottom w:w="0" w:type="dxa"/>
-          </w:tblCellMar>
-        </w:tblPrEx>
         <w:tc>
           <w:tcPr>
             <w:tcW w:w="1200" w:type="dxa"/>
@@ -18399,12 +19735,6 @@
         </w:tc>
       </w:tr>
       <w:tr>
-        <w:tblPrEx>
-          <w:tblCellMar>
-            <w:top w:w="0" w:type="dxa"/>
-            <w:bottom w:w="0" w:type="dxa"/>
-          </w:tblCellMar>
-        </w:tblPrEx>
         <w:trPr>
           <w:gridAfter w:val="8"/>
           <w:wAfter w:w="7600" w:type="dxa"/>
@@ -18470,12 +19800,6 @@
         </w:tc>
       </w:tr>
       <w:tr>
-        <w:tblPrEx>
-          <w:tblCellMar>
-            <w:top w:w="0" w:type="dxa"/>
-            <w:bottom w:w="0" w:type="dxa"/>
-          </w:tblCellMar>
-        </w:tblPrEx>
         <w:tc>
           <w:tcPr>
             <w:tcW w:w="1200" w:type="dxa"/>
@@ -18772,12 +20096,6 @@
         </w:tc>
       </w:tr>
       <w:tr>
-        <w:tblPrEx>
-          <w:tblCellMar>
-            <w:top w:w="0" w:type="dxa"/>
-            <w:bottom w:w="0" w:type="dxa"/>
-          </w:tblCellMar>
-        </w:tblPrEx>
         <w:tc>
           <w:tcPr>
             <w:tcW w:w="1200" w:type="dxa"/>
@@ -18805,6 +20123,7 @@
                 <w:sz w:val="18"/>
                 <w:szCs w:val="18"/>
               </w:rPr>
+              <w:lastRenderedPageBreak/>
               <w:t>SurvivalNet</w:t>
             </w:r>
             <w:proofErr w:type="spellEnd"/>
@@ -19074,12 +20393,6 @@
         </w:tc>
       </w:tr>
       <w:tr>
-        <w:tblPrEx>
-          <w:tblCellMar>
-            <w:top w:w="0" w:type="dxa"/>
-            <w:bottom w:w="0" w:type="dxa"/>
-          </w:tblCellMar>
-        </w:tblPrEx>
         <w:tc>
           <w:tcPr>
             <w:tcW w:w="1200" w:type="dxa"/>
@@ -19346,12 +20659,6 @@
         </w:tc>
       </w:tr>
       <w:tr>
-        <w:tblPrEx>
-          <w:tblCellMar>
-            <w:top w:w="0" w:type="dxa"/>
-            <w:bottom w:w="0" w:type="dxa"/>
-          </w:tblCellMar>
-        </w:tblPrEx>
         <w:trPr>
           <w:gridAfter w:val="8"/>
           <w:wAfter w:w="7600" w:type="dxa"/>
@@ -19393,12 +20700,6 @@
         </w:tc>
       </w:tr>
       <w:tr>
-        <w:tblPrEx>
-          <w:tblCellMar>
-            <w:top w:w="0" w:type="dxa"/>
-            <w:bottom w:w="0" w:type="dxa"/>
-          </w:tblCellMar>
-        </w:tblPrEx>
         <w:tc>
           <w:tcPr>
             <w:tcW w:w="1200" w:type="dxa"/>
@@ -19665,12 +20966,6 @@
         </w:tc>
       </w:tr>
       <w:tr>
-        <w:tblPrEx>
-          <w:tblCellMar>
-            <w:top w:w="0" w:type="dxa"/>
-            <w:bottom w:w="0" w:type="dxa"/>
-          </w:tblCellMar>
-        </w:tblPrEx>
         <w:tc>
           <w:tcPr>
             <w:tcW w:w="1200" w:type="dxa"/>
@@ -19973,12 +21268,6 @@
         </w:tc>
       </w:tr>
       <w:tr>
-        <w:tblPrEx>
-          <w:tblCellMar>
-            <w:top w:w="0" w:type="dxa"/>
-            <w:bottom w:w="0" w:type="dxa"/>
-          </w:tblCellMar>
-        </w:tblPrEx>
         <w:tc>
           <w:tcPr>
             <w:tcW w:w="1200" w:type="dxa"/>
@@ -20245,12 +21534,6 @@
         </w:tc>
       </w:tr>
       <w:tr>
-        <w:tblPrEx>
-          <w:tblCellMar>
-            <w:top w:w="0" w:type="dxa"/>
-            <w:bottom w:w="0" w:type="dxa"/>
-          </w:tblCellMar>
-        </w:tblPrEx>
         <w:tc>
           <w:tcPr>
             <w:tcW w:w="1200" w:type="dxa"/>
@@ -20277,7 +21560,6 @@
                 <w:sz w:val="18"/>
                 <w:szCs w:val="18"/>
               </w:rPr>
-              <w:lastRenderedPageBreak/>
               <w:t>Validación externa</w:t>
             </w:r>
           </w:p>
@@ -20536,12 +21818,6 @@
         </w:tc>
       </w:tr>
       <w:tr>
-        <w:tblPrEx>
-          <w:tblCellMar>
-            <w:top w:w="0" w:type="dxa"/>
-            <w:bottom w:w="0" w:type="dxa"/>
-          </w:tblCellMar>
-        </w:tblPrEx>
         <w:trPr>
           <w:gridAfter w:val="8"/>
           <w:wAfter w:w="7600" w:type="dxa"/>
@@ -20583,12 +21859,6 @@
         </w:tc>
       </w:tr>
       <w:tr>
-        <w:tblPrEx>
-          <w:tblCellMar>
-            <w:top w:w="0" w:type="dxa"/>
-            <w:bottom w:w="0" w:type="dxa"/>
-          </w:tblCellMar>
-        </w:tblPrEx>
         <w:tc>
           <w:tcPr>
             <w:tcW w:w="1200" w:type="dxa"/>
@@ -20867,12 +22137,6 @@
         </w:tc>
       </w:tr>
       <w:tr>
-        <w:tblPrEx>
-          <w:tblCellMar>
-            <w:top w:w="0" w:type="dxa"/>
-            <w:bottom w:w="0" w:type="dxa"/>
-          </w:tblCellMar>
-        </w:tblPrEx>
         <w:tc>
           <w:tcPr>
             <w:tcW w:w="1200" w:type="dxa"/>
@@ -21159,12 +22423,6 @@
         </w:tc>
       </w:tr>
       <w:tr>
-        <w:tblPrEx>
-          <w:tblCellMar>
-            <w:top w:w="0" w:type="dxa"/>
-            <w:bottom w:w="0" w:type="dxa"/>
-          </w:tblCellMar>
-        </w:tblPrEx>
         <w:tc>
           <w:tcPr>
             <w:tcW w:w="1200" w:type="dxa"/>
@@ -21465,6 +22723,7 @@
           <w:rFonts w:ascii="Arial" w:hAnsi="Arial"/>
           <w:sz w:val="22"/>
         </w:rPr>
+        <w:lastRenderedPageBreak/>
         <w:t>La revisión permite identificar las siguientes brechas que justifican el diseño del presente TFM:</w:t>
       </w:r>
     </w:p>
@@ -30380,25 +31639,7 @@
           <w:sz w:val="20"/>
           <w:szCs w:val="20"/>
         </w:rPr>
-        <w:t xml:space="preserve"> </w:t>
-      </w:r>
-      <w:proofErr w:type="spellStart"/>
-      <w:r>
-        <w:rPr>
-          <w:color w:val="FF0000"/>
-          <w:sz w:val="20"/>
-          <w:szCs w:val="20"/>
-        </w:rPr>
-        <w:t>of</w:t>
-      </w:r>
-      <w:proofErr w:type="spellEnd"/>
-      <w:r>
-        <w:rPr>
-          <w:color w:val="FF0000"/>
-          <w:sz w:val="20"/>
-          <w:szCs w:val="20"/>
-        </w:rPr>
-        <w:t xml:space="preserve"> </w:t>
+        <w:t xml:space="preserve"> of </w:t>
       </w:r>
       <w:proofErr w:type="spellStart"/>
       <w:r>
@@ -32229,8 +33470,8 @@
       </w:pPr>
     </w:p>
     <w:sectPr>
-      <w:headerReference w:type="default" r:id="rId17"/>
-      <w:footerReference w:type="default" r:id="rId18"/>
+      <w:headerReference w:type="default" r:id="rId16"/>
+      <w:footerReference w:type="default" r:id="rId17"/>
       <w:pgSz w:w="11906" w:h="16838"/>
       <w:pgMar w:top="1440" w:right="1440" w:bottom="1440" w:left="1800" w:header="708" w:footer="708" w:gutter="0"/>
       <w:pgNumType w:start="1"/>
@@ -34466,6 +35707,11 @@
     <w:basedOn w:val="Fuentedeprrafopredeter"/>
     <w:rsid w:val="00C06A75"/>
   </w:style>
+  <w:style w:type="character" w:customStyle="1" w:styleId="whitespace-normal">
+    <w:name w:val="whitespace-normal"/>
+    <w:basedOn w:val="Fuentedeprrafopredeter"/>
+    <w:rsid w:val="00587A4B"/>
+  </w:style>
 </w:styles>
 </file>
 

</xml_diff>